<commit_message>
Write the Analysis and Design Phase in paragraph form
Names the designs, models and Audit Engine algorithms in two paragraphs,
like the rest of Chapter 3, instead of bullets, an ERD figure and
numbered algorithm steps. Figure 2 is removed from the List of Figures;
page numbers and the Chapter 4 copy (now from page 53) are updated.

Co-Authored-By: Claude Opus 5.5 <noreply@anthropic.com>
Claude-Session: https://claude.ai/code/session_01MN4gTfErSULVtFJnUJ6zoR
</commit_message>
<xml_diff>
--- a/docs/paper/Thesis - Auditrix for KSU.docx
+++ b/docs/paper/Thesis - Auditrix for KSU.docx
@@ -662,6 +662,54 @@
       </w:r>
       <w:r>
         <w:tab/>
+        <w:t>45</w:t>
+      </w:r>
+    </w:p>
+    <w:p>
+      <w:pPr>
+        <w:pStyle w:val="TOC2"/>
+      </w:pPr>
+      <w:r>
+        <w:t>Data Gathering Techniques</w:t>
+      </w:r>
+      <w:r>
+        <w:tab/>
+        <w:t>46</w:t>
+      </w:r>
+    </w:p>
+    <w:p>
+      <w:pPr>
+        <w:pStyle w:val="TOC2"/>
+      </w:pPr>
+      <w:r>
+        <w:t>Data Gathering Tools</w:t>
+      </w:r>
+      <w:r>
+        <w:tab/>
+        <w:t>47</w:t>
+      </w:r>
+    </w:p>
+    <w:p>
+      <w:pPr>
+        <w:pStyle w:val="TOC2"/>
+      </w:pPr>
+      <w:r>
+        <w:t>Sources of the Data</w:t>
+      </w:r>
+      <w:r>
+        <w:tab/>
+        <w:t>48</w:t>
+      </w:r>
+    </w:p>
+    <w:p>
+      <w:pPr>
+        <w:pStyle w:val="TOC2"/>
+      </w:pPr>
+      <w:r>
+        <w:t>Data Analysis</w:t>
+      </w:r>
+      <w:r>
+        <w:tab/>
         <w:t>49</w:t>
       </w:r>
     </w:p>
@@ -670,7 +718,7 @@
         <w:pStyle w:val="TOC2"/>
       </w:pPr>
       <w:r>
-        <w:t>Data Gathering Techniques</w:t>
+        <w:t>Software Development Tools</w:t>
       </w:r>
       <w:r>
         <w:tab/>
@@ -679,34 +727,10 @@
     </w:p>
     <w:p>
       <w:pPr>
-        <w:pStyle w:val="TOC2"/>
-      </w:pPr>
-      <w:r>
-        <w:t>Data Gathering Tools</w:t>
-      </w:r>
-      <w:r>
-        <w:tab/>
-        <w:t>51</w:t>
-      </w:r>
-    </w:p>
-    <w:p>
-      <w:pPr>
-        <w:pStyle w:val="TOC2"/>
-      </w:pPr>
-      <w:r>
-        <w:t>Sources of the Data</w:t>
-      </w:r>
-      <w:r>
-        <w:tab/>
-        <w:t>52</w:t>
-      </w:r>
-    </w:p>
-    <w:p>
-      <w:pPr>
-        <w:pStyle w:val="TOC2"/>
-      </w:pPr>
-      <w:r>
-        <w:t>Data Analysis</w:t>
+        <w:pStyle w:val="TOC1"/>
+      </w:pPr>
+      <w:r>
+        <w:t>CHAPTER 4  RESULTS AND DISCUSSION</w:t>
       </w:r>
       <w:r>
         <w:tab/>
@@ -718,7 +742,7 @@
         <w:pStyle w:val="TOC2"/>
       </w:pPr>
       <w:r>
-        <w:t>Software Development Tools</w:t>
+        <w:t>Process of the Existing System (SOP No. 1)</w:t>
       </w:r>
       <w:r>
         <w:tab/>
@@ -727,10 +751,10 @@
     </w:p>
     <w:p>
       <w:pPr>
-        <w:pStyle w:val="TOC1"/>
-      </w:pPr>
-      <w:r>
-        <w:t>CHAPTER 4  RESULTS AND DISCUSSION</w:t>
+        <w:pStyle w:val="TOC2"/>
+      </w:pPr>
+      <w:r>
+        <w:t>Problems Encountered in the Current System (SOP No. 2)</w:t>
       </w:r>
       <w:r>
         <w:tab/>
@@ -742,36 +766,12 @@
         <w:pStyle w:val="TOC2"/>
       </w:pPr>
       <w:r>
-        <w:t>Process of the Existing System (SOP No. 1)</w:t>
-      </w:r>
-      <w:r>
-        <w:tab/>
-        <w:t>56</w:t>
-      </w:r>
-    </w:p>
-    <w:p>
-      <w:pPr>
-        <w:pStyle w:val="TOC2"/>
-      </w:pPr>
-      <w:r>
-        <w:t>Problems Encountered in the Current System (SOP No. 2)</w:t>
-      </w:r>
-      <w:r>
-        <w:tab/>
-        <w:t>59</w:t>
-      </w:r>
-    </w:p>
-    <w:p>
-      <w:pPr>
-        <w:pStyle w:val="TOC2"/>
-      </w:pPr>
-      <w:r>
         <w:lastRenderedPageBreak/>
         <w:t>Narrative Description of the Proposed System (SOP No. 3)</w:t>
       </w:r>
       <w:r>
         <w:tab/>
-        <w:t>61</w:t>
+        <w:t>58</w:t>
       </w:r>
     </w:p>
     <w:p>
@@ -783,7 +783,7 @@
       </w:r>
       <w:r>
         <w:tab/>
-        <w:t>71</w:t>
+        <w:t>68</w:t>
       </w:r>
     </w:p>
     <w:p>
@@ -795,7 +795,7 @@
       </w:r>
       <w:r>
         <w:tab/>
-        <w:t>73</w:t>
+        <w:t>70</w:t>
       </w:r>
     </w:p>
     <w:p>
@@ -807,7 +807,7 @@
       </w:r>
       <w:r>
         <w:tab/>
-        <w:t>90</w:t>
+        <w:t>87</w:t>
       </w:r>
     </w:p>
     <w:p>
@@ -816,6 +816,18 @@
       </w:pPr>
       <w:r>
         <w:t>Testing of the System</w:t>
+      </w:r>
+      <w:r>
+        <w:tab/>
+        <w:t>89</w:t>
+      </w:r>
+    </w:p>
+    <w:p>
+      <w:pPr>
+        <w:pStyle w:val="TOC2"/>
+      </w:pPr>
+      <w:r>
+        <w:t>Extent of Compliance of the Proposed System (SOP No. 4)</w:t>
       </w:r>
       <w:r>
         <w:tab/>
@@ -824,26 +836,14 @@
     </w:p>
     <w:p>
       <w:pPr>
-        <w:pStyle w:val="TOC2"/>
-      </w:pPr>
-      <w:r>
-        <w:t>Extent of Compliance of the Proposed System (SOP No. 4)</w:t>
+        <w:pStyle w:val="TOC1"/>
+      </w:pPr>
+      <w:r>
+        <w:t>REFERENCES</w:t>
       </w:r>
       <w:r>
         <w:tab/>
         <w:t>95</w:t>
-      </w:r>
-    </w:p>
-    <w:p>
-      <w:pPr>
-        <w:pStyle w:val="TOC1"/>
-      </w:pPr>
-      <w:r>
-        <w:t>REFERENCES</w:t>
-      </w:r>
-      <w:r>
-        <w:tab/>
-        <w:t>98</w:t>
       </w:r>
       <w:r>
         <w:fldChar w:fldCharType="end"/>
@@ -902,6 +902,18 @@
       </w:r>
       <w:r>
         <w:tab/>
+        <w:t>60</w:t>
+      </w:r>
+    </w:p>
+    <w:p>
+      <w:pPr>
+        <w:pStyle w:val="TableofFigures"/>
+      </w:pPr>
+      <w:r>
+        <w:t>Table 4.2. Year Level by Share of Curriculum Units Passed</w:t>
+      </w:r>
+      <w:r>
+        <w:tab/>
         <w:t>63</w:t>
       </w:r>
     </w:p>
@@ -910,11 +922,11 @@
         <w:pStyle w:val="TableofFigures"/>
       </w:pPr>
       <w:r>
-        <w:t>Table 4.2. Year Level by Share of Curriculum Units Passed</w:t>
+        <w:t xml:space="preserve">Table 4.3. Summary of the Automated Tests</w:t>
       </w:r>
       <w:r>
         <w:tab/>
-        <w:t>66</w:t>
+        <w:t>90</w:t>
       </w:r>
     </w:p>
     <w:p>
@@ -922,23 +934,11 @@
         <w:pStyle w:val="TableofFigures"/>
       </w:pPr>
       <w:r>
-        <w:t xml:space="preserve">Table 4.3. Summary of the Automated Tests</w:t>
+        <w:t xml:space="preserve">Table 4.4. Extent of Compliance of Auditrix with ISO/IEC 25010</w:t>
       </w:r>
       <w:r>
         <w:tab/>
-        <w:t>93</w:t>
-      </w:r>
-    </w:p>
-    <w:p>
-      <w:pPr>
-        <w:pStyle w:val="TableofFigures"/>
-      </w:pPr>
-      <w:r>
-        <w:t xml:space="preserve">Table 4.4. Extent of Compliance of Auditrix with ISO/IEC 25010</w:t>
-      </w:r>
-      <w:r>
-        <w:tab/>
-        <w:t>97</w:t>
+        <w:t>94</w:t>
       </w:r>
       <w:r>
         <w:fldChar w:fldCharType="end"/>
@@ -1005,11 +1005,11 @@
         <w:pStyle w:val="TableofFigures"/>
       </w:pPr>
       <w:r>
-        <w:t>Figure 2. Entity Relationship Diagram of Auditrix</w:t>
+        <w:t>Figure 4.1. Input-Process-Output Diagram of the Existing System</w:t>
       </w:r>
       <w:r>
         <w:tab/>
-        <w:t>43</w:t>
+        <w:t>56</w:t>
       </w:r>
     </w:p>
     <w:p>
@@ -1017,11 +1017,11 @@
         <w:pStyle w:val="TableofFigures"/>
       </w:pPr>
       <w:r>
-        <w:t>Figure 4.1. Input-Process-Output Diagram of the Existing System</w:t>
+        <w:t>Figure 4.2. Ishikawa (Fishbone) Diagram of the Problems in the Existing System</w:t>
       </w:r>
       <w:r>
         <w:tab/>
-        <w:t>59</w:t>
+        <w:t>58</w:t>
       </w:r>
     </w:p>
     <w:p>
@@ -1029,11 +1029,11 @@
         <w:pStyle w:val="TableofFigures"/>
       </w:pPr>
       <w:r>
-        <w:t>Figure 4.2. Ishikawa (Fishbone) Diagram of the Problems in the Existing System</w:t>
+        <w:t>Figure 4.3. Input-Process-Output Diagram of the Proposed System</w:t>
       </w:r>
       <w:r>
         <w:tab/>
-        <w:t>61</w:t>
+        <w:t>70</w:t>
       </w:r>
     </w:p>
     <w:p>
@@ -1041,7 +1041,19 @@
         <w:pStyle w:val="TableofFigures"/>
       </w:pPr>
       <w:r>
-        <w:t>Figure 4.3. Input-Process-Output Diagram of the Proposed System</w:t>
+        <w:t>Figure 4.4. Use Case Diagram of Auditrix</w:t>
+      </w:r>
+      <w:r>
+        <w:tab/>
+        <w:t>71</w:t>
+      </w:r>
+    </w:p>
+    <w:p>
+      <w:pPr>
+        <w:pStyle w:val="TableofFigures"/>
+      </w:pPr>
+      <w:r>
+        <w:t>Figure 4.5. Activity Diagram of the Audit of a Subject</w:t>
       </w:r>
       <w:r>
         <w:tab/>
@@ -1053,11 +1065,11 @@
         <w:pStyle w:val="TableofFigures"/>
       </w:pPr>
       <w:r>
-        <w:t>Figure 4.4. Use Case Diagram of Auditrix</w:t>
+        <w:t>Figure 4.6. Menu Diagram of Auditrix</w:t>
       </w:r>
       <w:r>
         <w:tab/>
-        <w:t>74</w:t>
+        <w:t>75</w:t>
       </w:r>
     </w:p>
     <w:p>
@@ -1065,7 +1077,19 @@
         <w:pStyle w:val="TableofFigures"/>
       </w:pPr>
       <w:r>
-        <w:t>Figure 4.5. Activity Diagram of the Audit of a Subject</w:t>
+        <w:t>Figure 4.7. User Interface of Auditrix</w:t>
+      </w:r>
+      <w:r>
+        <w:tab/>
+        <w:t>75</w:t>
+      </w:r>
+    </w:p>
+    <w:p>
+      <w:pPr>
+        <w:pStyle w:val="TableofFigures"/>
+      </w:pPr>
+      <w:r>
+        <w:t>Figure 4.7a. Log In — Dean role</w:t>
       </w:r>
       <w:r>
         <w:tab/>
@@ -1077,7 +1101,43 @@
         <w:pStyle w:val="TableofFigures"/>
       </w:pPr>
       <w:r>
-        <w:t>Figure 4.6. Menu Diagram of Auditrix</w:t>
+        <w:t>Figure 4.7b. Log In — Program Chairperson role</w:t>
+      </w:r>
+      <w:r>
+        <w:tab/>
+        <w:t>76</w:t>
+      </w:r>
+    </w:p>
+    <w:p>
+      <w:pPr>
+        <w:pStyle w:val="TableofFigures"/>
+      </w:pPr>
+      <w:r>
+        <w:t>Figure 4.7c. Students — search and list view</w:t>
+      </w:r>
+      <w:r>
+        <w:tab/>
+        <w:t>77</w:t>
+      </w:r>
+    </w:p>
+    <w:p>
+      <w:pPr>
+        <w:pStyle w:val="TableofFigures"/>
+      </w:pPr>
+      <w:r>
+        <w:t>Figure 4.7d. Student Audit — subject taken out of order and Irregular status</w:t>
+      </w:r>
+      <w:r>
+        <w:tab/>
+        <w:t>77</w:t>
+      </w:r>
+    </w:p>
+    <w:p>
+      <w:pPr>
+        <w:pStyle w:val="TableofFigures"/>
+      </w:pPr>
+      <w:r>
+        <w:t>Figure 4.7e. Transfer / Shift Records</w:t>
       </w:r>
       <w:r>
         <w:tab/>
@@ -1089,7 +1149,7 @@
         <w:pStyle w:val="TableofFigures"/>
       </w:pPr>
       <w:r>
-        <w:t>Figure 4.7. User Interface of Auditrix</w:t>
+        <w:t>Figure 4.7f. Enter Grades — choosing the term</w:t>
       </w:r>
       <w:r>
         <w:tab/>
@@ -1101,7 +1161,7 @@
         <w:pStyle w:val="TableofFigures"/>
       </w:pPr>
       <w:r>
-        <w:t>Figure 4.7a. Log In — Dean role</w:t>
+        <w:t>Figure 4.7g. Manage Curriculum Versions</w:t>
       </w:r>
       <w:r>
         <w:tab/>
@@ -1113,7 +1173,7 @@
         <w:pStyle w:val="TableofFigures"/>
       </w:pPr>
       <w:r>
-        <w:t>Figure 4.7b. Log In — Program Chairperson role</w:t>
+        <w:t>Figure 4.7h. Student Audit — status, term and reason for each subject</w:t>
       </w:r>
       <w:r>
         <w:tab/>
@@ -1125,7 +1185,7 @@
         <w:pStyle w:val="TableofFigures"/>
       </w:pPr>
       <w:r>
-        <w:t>Figure 4.7c. Students — search and list view</w:t>
+        <w:t>Figure 4.7i. Student Audit — fully compliant (Regular) example</w:t>
       </w:r>
       <w:r>
         <w:tab/>
@@ -1137,7 +1197,7 @@
         <w:pStyle w:val="TableofFigures"/>
       </w:pPr>
       <w:r>
-        <w:t>Figure 4.7d. Student Audit — subject taken out of order and Irregular status</w:t>
+        <w:t>Figure 4.7j. Export Curriculum — PDF output</w:t>
       </w:r>
       <w:r>
         <w:tab/>
@@ -1149,7 +1209,8 @@
         <w:pStyle w:val="TableofFigures"/>
       </w:pPr>
       <w:r>
-        <w:t>Figure 4.7e. Transfer / Shift Records</w:t>
+        <w:lastRenderedPageBreak/>
+        <w:t>Figure 4.7k. Create Program — new chairperson account with a temporary password</w:t>
       </w:r>
       <w:r>
         <w:tab/>
@@ -1161,19 +1222,7 @@
         <w:pStyle w:val="TableofFigures"/>
       </w:pPr>
       <w:r>
-        <w:t>Figure 4.7f. Enter Grades — choosing the term</w:t>
-      </w:r>
-      <w:r>
-        <w:tab/>
-        <w:t>81</w:t>
-      </w:r>
-    </w:p>
-    <w:p>
-      <w:pPr>
-        <w:pStyle w:val="TableofFigures"/>
-      </w:pPr>
-      <w:r>
-        <w:t>Figure 4.7g. Manage Curriculum Versions</w:t>
+        <w:t>Figure 4.7l. First Log In — password change with the rules checklist</w:t>
       </w:r>
       <w:r>
         <w:tab/>
@@ -1185,19 +1234,7 @@
         <w:pStyle w:val="TableofFigures"/>
       </w:pPr>
       <w:r>
-        <w:t>Figure 4.7h. Student Audit — status, term and reason for each subject</w:t>
-      </w:r>
-      <w:r>
-        <w:tab/>
-        <w:t>82</w:t>
-      </w:r>
-    </w:p>
-    <w:p>
-      <w:pPr>
-        <w:pStyle w:val="TableofFigures"/>
-      </w:pPr>
-      <w:r>
-        <w:t>Figure 4.7i. Student Audit — fully compliant (Regular) example</w:t>
+        <w:t>Figure 4.7m. Dean Dashboard — Current semester</w:t>
       </w:r>
       <w:r>
         <w:tab/>
@@ -1209,20 +1246,7 @@
         <w:pStyle w:val="TableofFigures"/>
       </w:pPr>
       <w:r>
-        <w:t>Figure 4.7j. Export Curriculum — PDF output</w:t>
-      </w:r>
-      <w:r>
-        <w:tab/>
-        <w:t>83</w:t>
-      </w:r>
-    </w:p>
-    <w:p>
-      <w:pPr>
-        <w:pStyle w:val="TableofFigures"/>
-      </w:pPr>
-      <w:r>
-        <w:lastRenderedPageBreak/>
-        <w:t>Figure 4.7k. Create Program — new chairperson account with a temporary password</w:t>
+        <w:t>Figure 4.7n. Chairperson Dashboard</w:t>
       </w:r>
       <w:r>
         <w:tab/>
@@ -1234,7 +1258,7 @@
         <w:pStyle w:val="TableofFigures"/>
       </w:pPr>
       <w:r>
-        <w:t>Figure 4.7l. First Log In — password change with the rules checklist</w:t>
+        <w:t>Figure 4.7o. Import Curriculum — preview of changes</w:t>
       </w:r>
       <w:r>
         <w:tab/>
@@ -1246,47 +1270,11 @@
         <w:pStyle w:val="TableofFigures"/>
       </w:pPr>
       <w:r>
-        <w:t>Figure 4.7m. Dean Dashboard — Current semester</w:t>
+        <w:t>Figure 4.7p. Grade Logbook</w:t>
       </w:r>
       <w:r>
         <w:tab/>
         <w:t>86</w:t>
-      </w:r>
-    </w:p>
-    <w:p>
-      <w:pPr>
-        <w:pStyle w:val="TableofFigures"/>
-      </w:pPr>
-      <w:r>
-        <w:t>Figure 4.7n. Chairperson Dashboard</w:t>
-      </w:r>
-      <w:r>
-        <w:tab/>
-        <w:t>87</w:t>
-      </w:r>
-    </w:p>
-    <w:p>
-      <w:pPr>
-        <w:pStyle w:val="TableofFigures"/>
-      </w:pPr>
-      <w:r>
-        <w:t>Figure 4.7o. Import Curriculum — preview of changes</w:t>
-      </w:r>
-      <w:r>
-        <w:tab/>
-        <w:t>88</w:t>
-      </w:r>
-    </w:p>
-    <w:p>
-      <w:pPr>
-        <w:pStyle w:val="TableofFigures"/>
-      </w:pPr>
-      <w:r>
-        <w:t>Figure 4.7p. Grade Logbook</w:t>
-      </w:r>
-      <w:r>
-        <w:tab/>
-        <w:t>89</w:t>
       </w:r>
     </w:p>
     <w:p>
@@ -1307,7 +1295,7 @@
       </w:r>
       <w:r>
         <w:tab/>
-        <w:t>90</w:t>
+        <w:t>87</w:t>
       </w:r>
       <w:r>
         <w:fldChar w:fldCharType="end"/>
@@ -6915,341 +6903,21 @@
           <w:sz w:val="24"/>
           <w:szCs w:val="24"/>
         </w:rPr>
-        <w:t xml:space="preserve">During this phase, requirements are translated into technical blueprints that evolve with each iteration. The following designs and models are made and used in the development of Auditrix:</w:t>
-      </w:r>
-      <w:r>
-        <w:rPr>
-          <w:rFonts w:ascii="Courier New" w:hAnsi="Courier New" w:cs="Courier New"/>
-          <w:sz w:val="24"/>
-          <w:szCs w:val="24"/>
-        </w:rPr>
-        <w:t xml:space="preserve"/>
-      </w:r>
-      <w:r>
-        <w:rPr>
-          <w:rFonts w:ascii="Courier New" w:hAnsi="Courier New" w:cs="Courier New"/>
-          <w:sz w:val="24"/>
-          <w:szCs w:val="24"/>
-        </w:rPr>
-        <w:t xml:space="preserve"/>
-      </w:r>
-    </w:p>
-    <w:p>
-      <w:pPr>
-        <w:numPr>
-          <w:ilvl w:val="0"/>
-          <w:numId w:val="4"/>
-        </w:numPr>
-        <w:spacing w:after="0" w:line="480" w:lineRule="auto"/>
-        <w:jc w:val="both"/>
-        <w:rPr>
-          <w:rFonts w:ascii="Courier New" w:hAnsi="Courier New" w:cs="Courier New"/>
-          <w:sz w:val="24"/>
-          <w:szCs w:val="24"/>
-        </w:rPr>
-      </w:pPr>
-      <w:r>
-        <w:rPr>
-          <w:rFonts w:ascii="Courier New" w:hAnsi="Courier New" w:cs="Courier New"/>
-          <w:sz w:val="24"/>
-          <w:szCs w:val="24"/>
-        </w:rPr>
-        <w:t xml:space="preserve">Iterative and Incremental Development model (Figure 1), which guides the cycles of planning, design, implementation and testing.</w:t>
-      </w:r>
-    </w:p>
-    <w:p>
-      <w:pPr>
-        <w:numPr>
-          <w:ilvl w:val="0"/>
-          <w:numId w:val="4"/>
-        </w:numPr>
-        <w:spacing w:after="0" w:line="480" w:lineRule="auto"/>
-        <w:jc w:val="both"/>
-        <w:rPr>
-          <w:rFonts w:ascii="Courier New" w:hAnsi="Courier New" w:cs="Courier New"/>
-          <w:sz w:val="24"/>
-          <w:szCs w:val="24"/>
-        </w:rPr>
-      </w:pPr>
-      <w:r>
-        <w:rPr>
-          <w:rFonts w:ascii="Courier New" w:hAnsi="Courier New" w:cs="Courier New"/>
-          <w:sz w:val="24"/>
-          <w:szCs w:val="24"/>
-        </w:rPr>
-        <w:t xml:space="preserve">Input-Process-Output (IPO) diagrams of the existing and the proposed system (Figures 4.1 and 4.3), which describe what each system takes in, does and produces.</w:t>
-      </w:r>
-    </w:p>
-    <w:p>
-      <w:pPr>
-        <w:numPr>
-          <w:ilvl w:val="0"/>
-          <w:numId w:val="4"/>
-        </w:numPr>
-        <w:spacing w:after="0" w:line="480" w:lineRule="auto"/>
-        <w:jc w:val="both"/>
-        <w:rPr>
-          <w:rFonts w:ascii="Courier New" w:hAnsi="Courier New" w:cs="Courier New"/>
-          <w:sz w:val="24"/>
-          <w:szCs w:val="24"/>
-        </w:rPr>
-      </w:pPr>
-      <w:r>
-        <w:rPr>
-          <w:rFonts w:ascii="Courier New" w:hAnsi="Courier New" w:cs="Courier New"/>
-          <w:sz w:val="24"/>
-          <w:szCs w:val="24"/>
-        </w:rPr>
-        <w:t xml:space="preserve">Ishikawa (fishbone) diagram (Figure 4.2), which analyzes the causes of the problems found in the existing system.</w:t>
-      </w:r>
-    </w:p>
-    <w:p>
-      <w:pPr>
-        <w:numPr>
-          <w:ilvl w:val="0"/>
-          <w:numId w:val="4"/>
-        </w:numPr>
-        <w:spacing w:after="0" w:line="480" w:lineRule="auto"/>
-        <w:jc w:val="both"/>
-        <w:rPr>
-          <w:rFonts w:ascii="Courier New" w:hAnsi="Courier New" w:cs="Courier New"/>
-          <w:sz w:val="24"/>
-          <w:szCs w:val="24"/>
-        </w:rPr>
-      </w:pPr>
-      <w:r>
-        <w:rPr>
-          <w:rFonts w:ascii="Courier New" w:hAnsi="Courier New" w:cs="Courier New"/>
-          <w:sz w:val="24"/>
-          <w:szCs w:val="24"/>
-        </w:rPr>
-        <w:t xml:space="preserve">Entity relationship diagram (ERD) of the database in Supabase (Figure 2), which shows the tables, their keys and how they are related; row-level security policies on every table limit each role to its own program or college.</w:t>
-      </w:r>
-    </w:p>
-    <w:p>
-      <w:pPr>
-        <w:numPr>
-          <w:ilvl w:val="0"/>
-          <w:numId w:val="4"/>
-        </w:numPr>
-        <w:spacing w:after="0" w:line="480" w:lineRule="auto"/>
-        <w:jc w:val="both"/>
-        <w:rPr>
-          <w:rFonts w:ascii="Courier New" w:hAnsi="Courier New" w:cs="Courier New"/>
-          <w:sz w:val="24"/>
-          <w:szCs w:val="24"/>
-        </w:rPr>
-      </w:pPr>
-      <w:r>
-        <w:rPr>
-          <w:rFonts w:ascii="Courier New" w:hAnsi="Courier New" w:cs="Courier New"/>
-          <w:sz w:val="24"/>
-          <w:szCs w:val="24"/>
-        </w:rPr>
-        <w:t xml:space="preserve">Use case diagram (Figure 4.4), which shows the actors of the system and what each of them can do.</w:t>
-      </w:r>
-    </w:p>
-    <w:p>
-      <w:pPr>
-        <w:numPr>
-          <w:ilvl w:val="0"/>
-          <w:numId w:val="4"/>
-        </w:numPr>
-        <w:spacing w:after="0" w:line="480" w:lineRule="auto"/>
-        <w:jc w:val="both"/>
-        <w:rPr>
-          <w:rFonts w:ascii="Courier New" w:hAnsi="Courier New" w:cs="Courier New"/>
-          <w:sz w:val="24"/>
-          <w:szCs w:val="24"/>
-        </w:rPr>
-      </w:pPr>
-      <w:r>
-        <w:rPr>
-          <w:rFonts w:ascii="Courier New" w:hAnsi="Courier New" w:cs="Courier New"/>
-          <w:sz w:val="24"/>
-          <w:szCs w:val="24"/>
-        </w:rPr>
-        <w:t xml:space="preserve">Activity diagram (Figure 4.5), which serves as the flowchart of the audit of a subject.</w:t>
-      </w:r>
-    </w:p>
-    <w:p>
-      <w:pPr>
-        <w:numPr>
-          <w:ilvl w:val="0"/>
-          <w:numId w:val="4"/>
-        </w:numPr>
-        <w:spacing w:after="0" w:line="480" w:lineRule="auto"/>
-        <w:jc w:val="both"/>
-        <w:rPr>
-          <w:rFonts w:ascii="Courier New" w:hAnsi="Courier New" w:cs="Courier New"/>
-          <w:sz w:val="24"/>
-          <w:szCs w:val="24"/>
-        </w:rPr>
-      </w:pPr>
-      <w:r>
-        <w:rPr>
-          <w:rFonts w:ascii="Courier New" w:hAnsi="Courier New" w:cs="Courier New"/>
-          <w:sz w:val="24"/>
-          <w:szCs w:val="24"/>
-        </w:rPr>
-        <w:t xml:space="preserve">Menu diagram (Figure 4.6), which shows the navigation of the system for each role.</w:t>
-      </w:r>
-    </w:p>
-    <w:p>
-      <w:pPr>
-        <w:numPr>
-          <w:ilvl w:val="0"/>
-          <w:numId w:val="4"/>
-        </w:numPr>
-        <w:spacing w:after="0" w:line="480" w:lineRule="auto"/>
-        <w:jc w:val="both"/>
-        <w:rPr>
-          <w:rFonts w:ascii="Courier New" w:hAnsi="Courier New" w:cs="Courier New"/>
-          <w:sz w:val="24"/>
-          <w:szCs w:val="24"/>
-        </w:rPr>
-      </w:pPr>
-      <w:r>
-        <w:rPr>
-          <w:rFonts w:ascii="Courier New" w:hAnsi="Courier New" w:cs="Courier New"/>
-          <w:sz w:val="24"/>
-          <w:szCs w:val="24"/>
-        </w:rPr>
-        <w:t xml:space="preserve">High-fidelity user interface mockups made in Figma, from which the screens in Figure 4.7 are built, using a responsive dashboard design in Tailwind CSS.</w:t>
-      </w:r>
-    </w:p>
-    <w:p>
-      <w:pPr>
-        <w:numPr>
-          <w:ilvl w:val="0"/>
-          <w:numId w:val="4"/>
-        </w:numPr>
-        <w:spacing w:after="0" w:line="480" w:lineRule="auto"/>
-        <w:jc w:val="both"/>
-        <w:rPr>
-          <w:rFonts w:ascii="Courier New" w:hAnsi="Courier New" w:cs="Courier New"/>
-          <w:sz w:val="24"/>
-          <w:szCs w:val="24"/>
-        </w:rPr>
-      </w:pPr>
-      <w:r>
-        <w:rPr>
-          <w:rFonts w:ascii="Courier New" w:hAnsi="Courier New" w:cs="Courier New"/>
-          <w:sz w:val="24"/>
-          <w:szCs w:val="24"/>
-        </w:rPr>
-        <w:t xml:space="preserve">The algorithms of the Audit Engine for the audit of a subject, the year level and the regular or irregular status, described below.</w:t>
-      </w:r>
-    </w:p>
-    <w:p>
-      <w:pPr>
-        <w:keepNext/>
-        <w:spacing w:after="0" w:line="480" w:lineRule="auto"/>
-        <w:jc w:val="center"/>
-        <w:rPr>
-          <w:rFonts w:ascii="Courier New" w:hAnsi="Courier New" w:cs="Courier New"/>
-          <w:sz w:val="24"/>
-          <w:szCs w:val="24"/>
-        </w:rPr>
-      </w:pPr>
-      <w:r>
-        <w:rPr>
-          <w:rFonts w:ascii="Courier New" w:hAnsi="Courier New" w:cs="Courier New"/>
-          <w:noProof/>
-        </w:rPr>
-        <w:drawing>
-          <wp:inline distT="0" distB="0" distL="0" distR="0" wp14:anchorId="47E47EAD" wp14:editId="5827132E">
-            <wp:extent cx="5486400" cy="4797232"/>
-            <wp:effectExtent l="0" t="0" r="5715" b="0"/>
-            <wp:docPr id="8100001" name="Figure 2"/>
-            <wp:cNvGraphicFramePr>
-              <a:graphicFrameLocks xmlns:a="http://schemas.openxmlformats.org/drawingml/2006/main" noChangeAspect="1"/>
-            </wp:cNvGraphicFramePr>
-            <a:graphic xmlns:a="http://schemas.openxmlformats.org/drawingml/2006/main">
-              <a:graphicData uri="http://schemas.openxmlformats.org/drawingml/2006/picture">
-                <pic:pic xmlns:pic="http://schemas.openxmlformats.org/drawingml/2006/picture">
-                  <pic:nvPicPr>
-                    <pic:cNvPr id="8100001" name="Figure 2"/>
-                    <pic:cNvPicPr>
-                      <a:picLocks noChangeAspect="1"/>
-                    </pic:cNvPicPr>
-                  </pic:nvPicPr>
-                  <pic:blipFill>
-                    <a:blip r:embed="rId9401"/>
-                    <a:stretch>
-                      <a:fillRect/>
-                    </a:stretch>
-                  </pic:blipFill>
-                  <pic:spPr>
-                    <a:xfrm>
-                      <a:off x="0" y="0"/>
-                      <a:ext cx="5486400" cy="4797232"/>
-                    </a:xfrm>
-                    <a:prstGeom prst="rect">
-                      <a:avLst/>
-                    </a:prstGeom>
-                  </pic:spPr>
-                </pic:pic>
-              </a:graphicData>
-            </a:graphic>
-          </wp:inline>
-        </w:drawing>
-      </w:r>
-    </w:p>
-    <w:p>
-      <w:pPr>
-        <w:spacing w:line="480" w:lineRule="auto"/>
-        <w:jc w:val="center"/>
-        <w:rPr>
-          <w:rFonts w:ascii="Courier New" w:hAnsi="Courier New" w:cs="Courier New"/>
-          <w:i/>
-          <w:iCs/>
-          <w:sz w:val="24"/>
-          <w:szCs w:val="24"/>
-        </w:rPr>
-      </w:pPr>
-      <w:r>
-        <w:rPr>
-          <w:rFonts w:ascii="Courier New" w:hAnsi="Courier New" w:cs="Courier New"/>
-          <w:b/>
-          <w:bCs/>
-          <w:i/>
-          <w:iCs/>
-          <w:sz w:val="24"/>
-          <w:szCs w:val="24"/>
-        </w:rPr>
-        <w:t xml:space="preserve">Figure </w:t>
-      </w:r>
-      <w:r>
-        <w:rPr>
-          <w:rFonts w:ascii="Courier New" w:hAnsi="Courier New" w:cs="Courier New"/>
-          <w:b/>
-          <w:bCs/>
-          <w:i/>
-          <w:iCs/>
-          <w:sz w:val="24"/>
-          <w:szCs w:val="24"/>
-        </w:rPr>
-        <w:t>2</w:t>
-      </w:r>
-      <w:r>
-        <w:rPr>
-          <w:rFonts w:ascii="Courier New" w:hAnsi="Courier New" w:cs="Courier New"/>
-          <w:i/>
-          <w:iCs/>
-          <w:sz w:val="24"/>
-          <w:szCs w:val="24"/>
-        </w:rPr>
-        <w:t>. Entity Relationship Diagram of Auditrix</w:t>
-      </w:r>
-      <w:r>
-        <w:fldChar w:fldCharType="begin"/>
-      </w:r>
-      <w:r>
-        <w:instrText xml:space="preserve"> TC "Figure 2. Entity Relationship Diagram of Auditrix" \f f \l 1 </w:instrText>
-      </w:r>
-      <w:r>
-        <w:fldChar w:fldCharType="end"/>
+        <w:t xml:space="preserve">During this phase, requirements are translated into technical blueprints that evolve with each iteration. The researchers use the Iterative and Incremental Development model to guide the cycles of planning, design, implementation, and testing, and an Ishikawa (fishbone) diagram to analyze the causes of the problems found in the existing system. Input-Process-Output (IPO) diagrams describe what the existing and the proposed systems take in, process, and produce. The database is designed in Supabase through an entity-relationship diagram (ERD) that defines the tables, their keys, and their relationships, with row-level security policies that limit each role to its own program or college. The behavior of the system is modeled with a use case diagram of the actors and what each of them can do, an activity diagram that serves as the flowchart of the audit of a subject, and a menu diagram of the system's navigation. High-fidelity user interface mockups are created in Figma, prioritizing a responsive "Command Center" dashboard using Tailwind CSS, so that the interface remains intuitive and seamless as new features, such as the curriculum and student import modules, are added.</w:t>
+      </w:r>
+      <w:r>
+        <w:rPr>
+          <w:rFonts w:ascii="Courier New" w:hAnsi="Courier New" w:cs="Courier New"/>
+          <w:sz w:val="24"/>
+          <w:szCs w:val="24"/>
+        </w:rPr>
+      </w:r>
+      <w:r>
+        <w:rPr>
+          <w:rFonts w:ascii="Courier New" w:hAnsi="Courier New" w:cs="Courier New"/>
+          <w:sz w:val="24"/>
+          <w:szCs w:val="24"/>
+        </w:rPr>
       </w:r>
     </w:p>
     <w:p>
@@ -7269,429 +6937,22 @@
           <w:sz w:val="24"/>
           <w:szCs w:val="24"/>
         </w:rPr>
-        <w:t xml:space="preserve">The Audit Engine follows three algorithms. They are written below as steps:</w:t>
-      </w:r>
-    </w:p>
-    <w:p>
-      <w:pPr>
-        <w:spacing w:line="480" w:lineRule="auto"/>
-        <w:jc w:val="both"/>
-        <w:rPr>
-          <w:rFonts w:ascii="Courier New" w:hAnsi="Courier New" w:cs="Courier New"/>
-          <w:sz w:val="24"/>
-          <w:szCs w:val="24"/>
-        </w:rPr>
-      </w:pPr>
-      <w:r>
-        <w:rPr>
-          <w:rFonts w:ascii="Courier New" w:hAnsi="Courier New" w:cs="Courier New"/>
-          <w:b/>
-          <w:bCs/>
-          <w:sz w:val="24"/>
-          <w:szCs w:val="24"/>
-        </w:rPr>
-        <w:t xml:space="preserve">Algorithm 1. Audit of a subject</w:t>
-      </w:r>
-    </w:p>
-    <w:p>
-      <w:pPr>
-        <w:spacing w:line="480" w:lineRule="auto"/>
-        <w:ind w:firstLine="720"/>
-        <w:jc w:val="both"/>
-        <w:rPr>
-          <w:rFonts w:ascii="Courier New" w:hAnsi="Courier New" w:cs="Courier New"/>
-          <w:sz w:val="24"/>
-          <w:szCs w:val="24"/>
-        </w:rPr>
-      </w:pPr>
-      <w:r>
-        <w:rPr>
-          <w:rFonts w:ascii="Courier New" w:hAnsi="Courier New" w:cs="Courier New"/>
-          <w:sz w:val="24"/>
-          <w:szCs w:val="24"/>
-        </w:rPr>
-        <w:t xml:space="preserve">For every subject of the student's curriculum, the Audit Engine:</w:t>
-      </w:r>
-    </w:p>
-    <w:p>
-      <w:pPr>
-        <w:spacing w:line="480" w:lineRule="auto"/>
-        <w:ind w:left="1080" w:hanging="360"/>
-        <w:jc w:val="both"/>
-        <w:rPr>
-          <w:rFonts w:ascii="Courier New" w:hAnsi="Courier New" w:cs="Courier New"/>
-          <w:sz w:val="24"/>
-          <w:szCs w:val="24"/>
-        </w:rPr>
-      </w:pPr>
-      <w:r>
-        <w:rPr>
-          <w:rFonts w:ascii="Courier New" w:hAnsi="Courier New" w:cs="Courier New"/>
-          <w:sz w:val="24"/>
-          <w:szCs w:val="24"/>
-        </w:rPr>
-        <w:t xml:space="preserve">1.</w:t>
-        <w:tab/>
-        <w:t xml:space="preserve">Takes the student's latest record of the subject: its grade, the term it was taken and, for an INC, the term the INC was resolved.</w:t>
-      </w:r>
-    </w:p>
-    <w:p>
-      <w:pPr>
-        <w:spacing w:line="480" w:lineRule="auto"/>
-        <w:ind w:left="1080" w:hanging="360"/>
-        <w:jc w:val="both"/>
-        <w:rPr>
-          <w:rFonts w:ascii="Courier New" w:hAnsi="Courier New" w:cs="Courier New"/>
-          <w:sz w:val="24"/>
-          <w:szCs w:val="24"/>
-        </w:rPr>
-      </w:pPr>
-      <w:r>
-        <w:rPr>
-          <w:rFonts w:ascii="Courier New" w:hAnsi="Courier New" w:cs="Courier New"/>
-          <w:sz w:val="24"/>
-          <w:szCs w:val="24"/>
-        </w:rPr>
-        <w:t xml:space="preserve">2.</w:t>
-        <w:tab/>
-        <w:t xml:space="preserve">If there is no record, marks the subject Available when every requirement has been passed, Pending when a requirement is still waiting for its final grade, and Unavailable otherwise, listing the missing requirements.</w:t>
-      </w:r>
-    </w:p>
-    <w:p>
-      <w:pPr>
-        <w:spacing w:line="480" w:lineRule="auto"/>
-        <w:ind w:left="1080" w:hanging="360"/>
-        <w:jc w:val="both"/>
-        <w:rPr>
-          <w:rFonts w:ascii="Courier New" w:hAnsi="Courier New" w:cs="Courier New"/>
-          <w:sz w:val="24"/>
-          <w:szCs w:val="24"/>
-        </w:rPr>
-      </w:pPr>
-      <w:r>
-        <w:rPr>
-          <w:rFonts w:ascii="Courier New" w:hAnsi="Courier New" w:cs="Courier New"/>
-          <w:sz w:val="24"/>
-          <w:szCs w:val="24"/>
-        </w:rPr>
-        <w:t xml:space="preserve">3.</w:t>
-        <w:tab/>
-        <w:t xml:space="preserve">If the subject is in progress or has an INC grade, marks it Pending.</w:t>
-      </w:r>
-    </w:p>
-    <w:p>
-      <w:pPr>
-        <w:spacing w:line="480" w:lineRule="auto"/>
-        <w:ind w:left="1080" w:hanging="360"/>
-        <w:jc w:val="both"/>
-        <w:rPr>
-          <w:rFonts w:ascii="Courier New" w:hAnsi="Courier New" w:cs="Courier New"/>
-          <w:sz w:val="24"/>
-          <w:szCs w:val="24"/>
-        </w:rPr>
-      </w:pPr>
-      <w:r>
-        <w:rPr>
-          <w:rFonts w:ascii="Courier New" w:hAnsi="Courier New" w:cs="Courier New"/>
-          <w:sz w:val="24"/>
-          <w:szCs w:val="24"/>
-        </w:rPr>
-        <w:t xml:space="preserve">4.</w:t>
-        <w:tab/>
-        <w:t xml:space="preserve">Otherwise, compares the terms of each requirement: a prerequisite must have been passed in a term before the subject was taken, a co-requisite must have been taken in the same term, the year standing must have been reached going into that term, and for "all subjects completed", every other subject must have been passed before that term.</w:t>
-      </w:r>
-    </w:p>
-    <w:p>
-      <w:pPr>
-        <w:spacing w:line="480" w:lineRule="auto"/>
-        <w:ind w:left="1080" w:hanging="360"/>
-        <w:jc w:val="both"/>
-        <w:rPr>
-          <w:rFonts w:ascii="Courier New" w:hAnsi="Courier New" w:cs="Courier New"/>
-          <w:sz w:val="24"/>
-          <w:szCs w:val="24"/>
-        </w:rPr>
-      </w:pPr>
-      <w:r>
-        <w:rPr>
-          <w:rFonts w:ascii="Courier New" w:hAnsi="Courier New" w:cs="Courier New"/>
-          <w:sz w:val="24"/>
-          <w:szCs w:val="24"/>
-        </w:rPr>
-        <w:t xml:space="preserve">5.</w:t>
-        <w:tab/>
-        <w:t xml:space="preserve">If a requirement was not met, marks the subject Violation, states the reason and gives it no credit; if the year standing cannot be confirmed from the grades, marks it "Year standing: please verify".</w:t>
-      </w:r>
-    </w:p>
-    <w:p>
-      <w:pPr>
-        <w:spacing w:line="480" w:lineRule="auto"/>
-        <w:ind w:left="1080" w:hanging="360"/>
-        <w:jc w:val="both"/>
-        <w:rPr>
-          <w:rFonts w:ascii="Courier New" w:hAnsi="Courier New" w:cs="Courier New"/>
-          <w:sz w:val="24"/>
-          <w:szCs w:val="24"/>
-        </w:rPr>
-      </w:pPr>
-      <w:r>
-        <w:rPr>
-          <w:rFonts w:ascii="Courier New" w:hAnsi="Courier New" w:cs="Courier New"/>
-          <w:sz w:val="24"/>
-          <w:szCs w:val="24"/>
-        </w:rPr>
-        <w:t xml:space="preserve">6.</w:t>
-        <w:tab/>
-        <w:t xml:space="preserve">If every requirement was met, marks a passed subject (whose co-requisite was also passed) Completed, and a failed subject Available for retaking.</w:t>
-      </w:r>
-    </w:p>
-    <w:p>
-      <w:pPr>
-        <w:spacing w:line="480" w:lineRule="auto"/>
-        <w:jc w:val="both"/>
-        <w:rPr>
-          <w:rFonts w:ascii="Courier New" w:hAnsi="Courier New" w:cs="Courier New"/>
-          <w:sz w:val="24"/>
-          <w:szCs w:val="24"/>
-        </w:rPr>
-      </w:pPr>
-      <w:r>
-        <w:rPr>
-          <w:rFonts w:ascii="Courier New" w:hAnsi="Courier New" w:cs="Courier New"/>
-          <w:b/>
-          <w:bCs/>
-          <w:sz w:val="24"/>
-          <w:szCs w:val="24"/>
-        </w:rPr>
-        <w:t xml:space="preserve">Algorithm 2. Year level</w:t>
-      </w:r>
-    </w:p>
-    <w:p>
-      <w:pPr>
-        <w:spacing w:line="480" w:lineRule="auto"/>
-        <w:ind w:firstLine="720"/>
-        <w:jc w:val="both"/>
-        <w:rPr>
-          <w:rFonts w:ascii="Courier New" w:hAnsi="Courier New" w:cs="Courier New"/>
-          <w:sz w:val="24"/>
-          <w:szCs w:val="24"/>
-        </w:rPr>
-      </w:pPr>
-      <w:r>
-        <w:rPr>
-          <w:rFonts w:ascii="Courier New" w:hAnsi="Courier New" w:cs="Courier New"/>
-          <w:sz w:val="24"/>
-          <w:szCs w:val="24"/>
-        </w:rPr>
-        <w:t xml:space="preserve">To find a student's year level for the current semester, the Audit Engine:</w:t>
-      </w:r>
-    </w:p>
-    <w:p>
-      <w:pPr>
-        <w:spacing w:line="480" w:lineRule="auto"/>
-        <w:ind w:left="1080" w:hanging="360"/>
-        <w:jc w:val="both"/>
-        <w:rPr>
-          <w:rFonts w:ascii="Courier New" w:hAnsi="Courier New" w:cs="Courier New"/>
-          <w:sz w:val="24"/>
-          <w:szCs w:val="24"/>
-        </w:rPr>
-      </w:pPr>
-      <w:r>
-        <w:rPr>
-          <w:rFonts w:ascii="Courier New" w:hAnsi="Courier New" w:cs="Courier New"/>
-          <w:sz w:val="24"/>
-          <w:szCs w:val="24"/>
-        </w:rPr>
-        <w:t xml:space="preserve">1.</w:t>
-        <w:tab/>
-        <w:t xml:space="preserve">Adds up the units of the subjects passed with credit in the terms before the current semester.</w:t>
-      </w:r>
-    </w:p>
-    <w:p>
-      <w:pPr>
-        <w:spacing w:line="480" w:lineRule="auto"/>
-        <w:ind w:left="1080" w:hanging="360"/>
-        <w:jc w:val="both"/>
-        <w:rPr>
-          <w:rFonts w:ascii="Courier New" w:hAnsi="Courier New" w:cs="Courier New"/>
-          <w:sz w:val="24"/>
-          <w:szCs w:val="24"/>
-        </w:rPr>
-      </w:pPr>
-      <w:r>
-        <w:rPr>
-          <w:rFonts w:ascii="Courier New" w:hAnsi="Courier New" w:cs="Courier New"/>
-          <w:sz w:val="24"/>
-          <w:szCs w:val="24"/>
-        </w:rPr>
-        <w:t xml:space="preserve">2.</w:t>
-        <w:tab/>
-        <w:t xml:space="preserve">Divides this by the total units of the student's curriculum.</w:t>
-      </w:r>
-    </w:p>
-    <w:p>
-      <w:pPr>
-        <w:spacing w:line="480" w:lineRule="auto"/>
-        <w:ind w:left="1080" w:hanging="360"/>
-        <w:jc w:val="both"/>
-        <w:rPr>
-          <w:rFonts w:ascii="Courier New" w:hAnsi="Courier New" w:cs="Courier New"/>
-          <w:sz w:val="24"/>
-          <w:szCs w:val="24"/>
-        </w:rPr>
-      </w:pPr>
-      <w:r>
-        <w:rPr>
-          <w:rFonts w:ascii="Courier New" w:hAnsi="Courier New" w:cs="Courier New"/>
-          <w:sz w:val="24"/>
-          <w:szCs w:val="24"/>
-        </w:rPr>
-        <w:t xml:space="preserve">3.</w:t>
-        <w:tab/>
-        <w:t xml:space="preserve">Assigns 1st year below 25%, 2nd year from 25% to 50%, 3rd year above 50%, and 4th year at 75% or more; passing every subject of the earlier years also moves the student up.</w:t>
-      </w:r>
-    </w:p>
-    <w:p>
-      <w:pPr>
-        <w:spacing w:line="480" w:lineRule="auto"/>
-        <w:ind w:left="1080" w:hanging="360"/>
-        <w:jc w:val="both"/>
-        <w:rPr>
-          <w:rFonts w:ascii="Courier New" w:hAnsi="Courier New" w:cs="Courier New"/>
-          <w:sz w:val="24"/>
-          <w:szCs w:val="24"/>
-        </w:rPr>
-      </w:pPr>
-      <w:r>
-        <w:rPr>
-          <w:rFonts w:ascii="Courier New" w:hAnsi="Courier New" w:cs="Courier New"/>
-          <w:sz w:val="24"/>
-          <w:szCs w:val="24"/>
-        </w:rPr>
-        <w:t xml:space="preserve">4.</w:t>
-        <w:tab/>
-        <w:t xml:space="preserve">Uses the year level set by the chairperson instead, when one was set by hand for a special case.</w:t>
-      </w:r>
-    </w:p>
-    <w:p>
-      <w:pPr>
-        <w:spacing w:line="480" w:lineRule="auto"/>
-        <w:jc w:val="both"/>
-        <w:rPr>
-          <w:rFonts w:ascii="Courier New" w:hAnsi="Courier New" w:cs="Courier New"/>
-          <w:sz w:val="24"/>
-          <w:szCs w:val="24"/>
-        </w:rPr>
-      </w:pPr>
-      <w:r>
-        <w:rPr>
-          <w:rFonts w:ascii="Courier New" w:hAnsi="Courier New" w:cs="Courier New"/>
-          <w:b/>
-          <w:bCs/>
-          <w:sz w:val="24"/>
-          <w:szCs w:val="24"/>
-        </w:rPr>
-        <w:t xml:space="preserve">Algorithm 3. Regular or irregular status</w:t>
-      </w:r>
-    </w:p>
-    <w:p>
-      <w:pPr>
-        <w:spacing w:line="480" w:lineRule="auto"/>
-        <w:ind w:firstLine="720"/>
-        <w:jc w:val="both"/>
-        <w:rPr>
-          <w:rFonts w:ascii="Courier New" w:hAnsi="Courier New" w:cs="Courier New"/>
-          <w:sz w:val="24"/>
-          <w:szCs w:val="24"/>
-        </w:rPr>
-      </w:pPr>
-      <w:r>
-        <w:rPr>
-          <w:rFonts w:ascii="Courier New" w:hAnsi="Courier New" w:cs="Courier New"/>
-          <w:sz w:val="24"/>
-          <w:szCs w:val="24"/>
-        </w:rPr>
-        <w:t xml:space="preserve">To classify a student for the current semester, the Audit Engine:</w:t>
-      </w:r>
-    </w:p>
-    <w:p>
-      <w:pPr>
-        <w:spacing w:line="480" w:lineRule="auto"/>
-        <w:ind w:left="1080" w:hanging="360"/>
-        <w:jc w:val="both"/>
-        <w:rPr>
-          <w:rFonts w:ascii="Courier New" w:hAnsi="Courier New" w:cs="Courier New"/>
-          <w:sz w:val="24"/>
-          <w:szCs w:val="24"/>
-        </w:rPr>
-      </w:pPr>
-      <w:r>
-        <w:rPr>
-          <w:rFonts w:ascii="Courier New" w:hAnsi="Courier New" w:cs="Courier New"/>
-          <w:sz w:val="24"/>
-          <w:szCs w:val="24"/>
-        </w:rPr>
-        <w:t xml:space="preserve">1.</w:t>
-        <w:tab/>
-        <w:t xml:space="preserve">Takes the prescribed load: the curriculum's subjects for the student's year level and the current semester, leaving out those already passed.</w:t>
-      </w:r>
-    </w:p>
-    <w:p>
-      <w:pPr>
-        <w:spacing w:line="480" w:lineRule="auto"/>
-        <w:ind w:left="1080" w:hanging="360"/>
-        <w:jc w:val="both"/>
-        <w:rPr>
-          <w:rFonts w:ascii="Courier New" w:hAnsi="Courier New" w:cs="Courier New"/>
-          <w:sz w:val="24"/>
-          <w:szCs w:val="24"/>
-        </w:rPr>
-      </w:pPr>
-      <w:r>
-        <w:rPr>
-          <w:rFonts w:ascii="Courier New" w:hAnsi="Courier New" w:cs="Courier New"/>
-          <w:sz w:val="24"/>
-          <w:szCs w:val="24"/>
-        </w:rPr>
-        <w:t xml:space="preserve">2.</w:t>
-        <w:tab/>
-        <w:t xml:space="preserve">Marks the status Not determined when nothing is recorded for the student in the current semester.</w:t>
-      </w:r>
-    </w:p>
-    <w:p>
-      <w:pPr>
-        <w:spacing w:line="480" w:lineRule="auto"/>
-        <w:ind w:left="1080" w:hanging="360"/>
-        <w:jc w:val="both"/>
-        <w:rPr>
-          <w:rFonts w:ascii="Courier New" w:hAnsi="Courier New" w:cs="Courier New"/>
-          <w:sz w:val="24"/>
-          <w:szCs w:val="24"/>
-        </w:rPr>
-      </w:pPr>
-      <w:r>
-        <w:rPr>
-          <w:rFonts w:ascii="Courier New" w:hAnsi="Courier New" w:cs="Courier New"/>
-          <w:sz w:val="24"/>
-          <w:szCs w:val="24"/>
-        </w:rPr>
-        <w:t xml:space="preserve">3.</w:t>
-        <w:tab/>
-        <w:t xml:space="preserve">Marks the student Regular when every prescribed subject is graded or in progress in the current semester, and Irregular otherwise, listing the missing subjects.</w:t>
-      </w:r>
-    </w:p>
-    <w:p>
-      <w:pPr>
-        <w:spacing w:line="480" w:lineRule="auto"/>
-        <w:ind w:firstLine="720"/>
-        <w:jc w:val="both"/>
-        <w:rPr>
-          <w:rFonts w:ascii="Courier New" w:hAnsi="Courier New" w:cs="Courier New"/>
-          <w:sz w:val="24"/>
-          <w:szCs w:val="24"/>
-        </w:rPr>
-      </w:pPr>
+        <w:t xml:space="preserve">The Audit Engine is designed around three algorithms. The first audits each subject by comparing the term in which the subject was taken with the terms in which its requirements were passed, and assigns one of five statuses: Completed, Available, Pending, Unavailable, or Violation. The second computes a student's year level from the share of the curriculum's units passed before the current semester. The third classifies a student as regular or irregular by comparing the subjects the student is enrolled in with the prescribed load for the current semester.</w:t>
+      </w:r>
+      <w:r>
+        <w:rPr>
+          <w:rFonts w:ascii="Courier New" w:hAnsi="Courier New" w:cs="Courier New"/>
+          <w:sz w:val="24"/>
+          <w:szCs w:val="24"/>
+        </w:rPr>
+      </w:r>
+      <w:r>
+        <w:rPr>
+          <w:rFonts w:ascii="Courier New" w:hAnsi="Courier New" w:cs="Courier New"/>
+          <w:sz w:val="24"/>
+          <w:szCs w:val="24"/>
+        </w:rPr>
+      </w:r>
     </w:p>
     <w:p>
       <w:pPr>

</xml_diff>

<commit_message>
Thesis: remove the review comment so Word prints full pages
With a comment in the file, Word prints with markup and shrinks every page
to leave room for the comment area, so the printout did not fill the paper.

Co-Authored-By: Claude Opus 5.5 <noreply@anthropic.com>
Claude-Session: https://claude.ai/code/session_01MN4gTfErSULVtFJnUJ6zoR
</commit_message>
<xml_diff>
--- a/docs/paper/Thesis - Auditrix for KSU.docx
+++ b/docs/paper/Thesis - Auditrix for KSU.docx
@@ -4445,25 +4445,12 @@
         <w:lastRenderedPageBreak/>
         <w:t xml:space="preserve">Beyond basic auditing, the system includes a dashboard that summarizes each program: the total number of students, the regular and irregular students, the students with violations, the curriculum versions, and the number of students who shifted, transferred, or dropped. Its charts show the students per year level (Freshman to Senior) and the </w:t>
       </w:r>
-      <w:commentRangeStart w:id="0"/>
       <w:r>
         <w:rPr>
           <w:rFonts w:ascii="Courier New" w:eastAsia="-webkit-standard" w:hAnsi="Courier New" w:cs="Courier New"/>
           <w:color w:val="000000"/>
         </w:rPr>
         <w:t>subjects most often taken out of order. A "Needs attention" list points the chairperson to the students who need action, and the Dean can compare the programs of the college side by side.</w:t>
-      </w:r>
-      <w:commentRangeEnd w:id="0"/>
-      <w:r>
-        <w:rPr>
-          <w:rStyle w:val="CommentReference"/>
-          <w:rFonts w:ascii="Courier New" w:eastAsia="-webkit-standard" w:hAnsi="Courier New" w:cs="Courier New"/>
-          <w:bCs/>
-          <w:color w:val="000000"/>
-          <w:sz w:val="24"/>
-          <w:szCs w:val="24"/>
-        </w:rPr>
-        <w:commentReference w:id="0"/>
       </w:r>
     </w:p>
     <w:p>
@@ -17934,45 +17921,6 @@
     </w:sectPr>
   </w:body>
 </w:document>
-</file>
-
-<file path=word/comments.xml><?xml version="1.0" encoding="utf-8"?>
-<w:comments xmlns:wpc="http://schemas.microsoft.com/office/word/2010/wordprocessingCanvas" xmlns:cx="http://schemas.microsoft.com/office/drawing/2014/chartex" xmlns:cx1="http://schemas.microsoft.com/office/drawing/2015/9/8/chartex" xmlns:cx2="http://schemas.microsoft.com/office/drawing/2015/10/21/chartex" xmlns:cx3="http://schemas.microsoft.com/office/drawing/2016/5/9/chartex" xmlns:cx4="http://schemas.microsoft.com/office/drawing/2016/5/10/chartex" xmlns:cx5="http://schemas.microsoft.com/office/drawing/2016/5/11/chartex" xmlns:cx6="http://schemas.microsoft.com/office/drawing/2016/5/12/chartex" xmlns:cx7="http://schemas.microsoft.com/office/drawing/2016/5/13/chartex" xmlns:cx8="http://schemas.microsoft.com/office/drawing/2016/5/14/chartex" xmlns:mc="http://schemas.openxmlformats.org/markup-compatibility/2006" xmlns:aink="http://schemas.microsoft.com/office/drawing/2016/ink" xmlns:am3d="http://schemas.microsoft.com/office/drawing/2017/model3d" xmlns:o="urn:schemas-microsoft-com:office:office" xmlns:oel="http://schemas.microsoft.com/office/2019/extlst" xmlns:r="http://schemas.openxmlformats.org/officeDocument/2006/relationships" xmlns:m="http://schemas.openxmlformats.org/officeDocument/2006/math" xmlns:v="urn:schemas-microsoft-com:vml" xmlns:wp14="http://schemas.microsoft.com/office/word/2010/wordprocessingDrawing" xmlns:wp="http://schemas.openxmlformats.org/drawingml/2006/wordprocessingDrawing" xmlns:w10="urn:schemas-microsoft-com:office:word" xmlns:w="http://schemas.openxmlformats.org/wordprocessingml/2006/main" xmlns:w14="http://schemas.microsoft.com/office/word/2010/wordml" xmlns:w15="http://schemas.microsoft.com/office/word/2012/wordml" xmlns:w16cex="http://schemas.microsoft.com/office/word/2018/wordml/cex" xmlns:w16cid="http://schemas.microsoft.com/office/word/2016/wordml/cid" xmlns:w16="http://schemas.microsoft.com/office/word/2018/wordml" xmlns:w16du="http://schemas.microsoft.com/office/word/2023/wordml/word16du" xmlns:w16sdtdh="http://schemas.microsoft.com/office/word/2020/wordml/sdtdatahash" xmlns:w16sdtfl="http://schemas.microsoft.com/office/word/2024/wordml/sdtformatlock" xmlns:w16se="http://schemas.microsoft.com/office/word/2015/wordml/symex" xmlns:wpg="http://schemas.microsoft.com/office/word/2010/wordprocessingGroup" xmlns:wpi="http://schemas.microsoft.com/office/word/2010/wordprocessingInk" xmlns:wne="http://schemas.microsoft.com/office/word/2006/wordml" xmlns:wps="http://schemas.microsoft.com/office/word/2010/wordprocessingShape" mc:Ignorable="w14 w15 w16se w16cid w16 w16cex w16sdtdh w16sdtfl w16du wp14">
-  <w:comment w:id="0" w:author="lonnnmirabueno@outlook.com" w:date="2026-10-14T14:01:00Z" w:initials="l">
-    <w:p>
-      <w:pPr>
-        <w:pStyle w:val="CommentText"/>
-      </w:pPr>
-      <w:r>
-        <w:rPr>
-          <w:rStyle w:val="CommentReference"/>
-        </w:rPr>
-        <w:annotationRef/>
-      </w:r>
-      <w:r>
-        <w:t>Review</w:t>
-      </w:r>
-    </w:p>
-  </w:comment>
-</w:comments>
-</file>
-
-<file path=word/commentsExtended.xml><?xml version="1.0" encoding="utf-8"?>
-<w15:commentsEx xmlns:wpc="http://schemas.microsoft.com/office/word/2010/wordprocessingCanvas" xmlns:cx="http://schemas.microsoft.com/office/drawing/2014/chartex" xmlns:cx1="http://schemas.microsoft.com/office/drawing/2015/9/8/chartex" xmlns:cx2="http://schemas.microsoft.com/office/drawing/2015/10/21/chartex" xmlns:cx3="http://schemas.microsoft.com/office/drawing/2016/5/9/chartex" xmlns:cx4="http://schemas.microsoft.com/office/drawing/2016/5/10/chartex" xmlns:cx5="http://schemas.microsoft.com/office/drawing/2016/5/11/chartex" xmlns:cx6="http://schemas.microsoft.com/office/drawing/2016/5/12/chartex" xmlns:cx7="http://schemas.microsoft.com/office/drawing/2016/5/13/chartex" xmlns:cx8="http://schemas.microsoft.com/office/drawing/2016/5/14/chartex" xmlns:mc="http://schemas.openxmlformats.org/markup-compatibility/2006" xmlns:aink="http://schemas.microsoft.com/office/drawing/2016/ink" xmlns:am3d="http://schemas.microsoft.com/office/drawing/2017/model3d" xmlns:o="urn:schemas-microsoft-com:office:office" xmlns:oel="http://schemas.microsoft.com/office/2019/extlst" xmlns:r="http://schemas.openxmlformats.org/officeDocument/2006/relationships" xmlns:m="http://schemas.openxmlformats.org/officeDocument/2006/math" xmlns:v="urn:schemas-microsoft-com:vml" xmlns:wp14="http://schemas.microsoft.com/office/word/2010/wordprocessingDrawing" xmlns:wp="http://schemas.openxmlformats.org/drawingml/2006/wordprocessingDrawing" xmlns:w10="urn:schemas-microsoft-com:office:word" xmlns:w="http://schemas.openxmlformats.org/wordprocessingml/2006/main" xmlns:w14="http://schemas.microsoft.com/office/word/2010/wordml" xmlns:w15="http://schemas.microsoft.com/office/word/2012/wordml" xmlns:w16cex="http://schemas.microsoft.com/office/word/2018/wordml/cex" xmlns:w16cid="http://schemas.microsoft.com/office/word/2016/wordml/cid" xmlns:w16="http://schemas.microsoft.com/office/word/2018/wordml" xmlns:w16du="http://schemas.microsoft.com/office/word/2023/wordml/word16du" xmlns:w16sdtdh="http://schemas.microsoft.com/office/word/2020/wordml/sdtdatahash" xmlns:w16sdtfl="http://schemas.microsoft.com/office/word/2024/wordml/sdtformatlock" xmlns:w16se="http://schemas.microsoft.com/office/word/2015/wordml/symex" xmlns:wpg="http://schemas.microsoft.com/office/word/2010/wordprocessingGroup" xmlns:wpi="http://schemas.microsoft.com/office/word/2010/wordprocessingInk" xmlns:wne="http://schemas.microsoft.com/office/word/2006/wordml" xmlns:wps="http://schemas.microsoft.com/office/word/2010/wordprocessingShape" mc:Ignorable="w14 w15 w16se w16cid w16 w16cex w16sdtdh w16sdtfl w16du wp14">
-  <w15:commentEx w15:paraId="617894E2" w15:done="0"/>
-</w15:commentsEx>
-</file>
-
-<file path=word/commentsExtensible.xml><?xml version="1.0" encoding="utf-8"?>
-<w16cex:commentsExtensible xmlns:wpc="http://schemas.microsoft.com/office/word/2010/wordprocessingCanvas" xmlns:cx="http://schemas.microsoft.com/office/drawing/2014/chartex" xmlns:cx1="http://schemas.microsoft.com/office/drawing/2015/9/8/chartex" xmlns:cx2="http://schemas.microsoft.com/office/drawing/2015/10/21/chartex" xmlns:cx3="http://schemas.microsoft.com/office/drawing/2016/5/9/chartex" xmlns:cx4="http://schemas.microsoft.com/office/drawing/2016/5/10/chartex" xmlns:cx5="http://schemas.microsoft.com/office/drawing/2016/5/11/chartex" xmlns:cx6="http://schemas.microsoft.com/office/drawing/2016/5/12/chartex" xmlns:cx7="http://schemas.microsoft.com/office/drawing/2016/5/13/chartex" xmlns:cx8="http://schemas.microsoft.com/office/drawing/2016/5/14/chartex" xmlns:cr="http://schemas.microsoft.com/office/comments/2020/reactions" xmlns:mc="http://schemas.openxmlformats.org/markup-compatibility/2006" xmlns:aink="http://schemas.microsoft.com/office/drawing/2016/ink" xmlns:am3d="http://schemas.microsoft.com/office/drawing/2017/model3d" xmlns:o="urn:schemas-microsoft-com:office:office" xmlns:oel="http://schemas.microsoft.com/office/2019/extlst" xmlns:r="http://schemas.openxmlformats.org/officeDocument/2006/relationships" xmlns:m="http://schemas.openxmlformats.org/officeDocument/2006/math" xmlns:v="urn:schemas-microsoft-com:vml" xmlns:wp14="http://schemas.microsoft.com/office/word/2010/wordprocessingDrawing" xmlns:wp="http://schemas.openxmlformats.org/drawingml/2006/wordprocessingDrawing" xmlns:w10="urn:schemas-microsoft-com:office:word" xmlns:w="http://schemas.openxmlformats.org/wordprocessingml/2006/main" xmlns:w14="http://schemas.microsoft.com/office/word/2010/wordml" xmlns:w15="http://schemas.microsoft.com/office/word/2012/wordml" xmlns:w16cex="http://schemas.microsoft.com/office/word/2018/wordml/cex" xmlns:w16cid="http://schemas.microsoft.com/office/word/2016/wordml/cid" xmlns:w16="http://schemas.microsoft.com/office/word/2018/wordml" xmlns:w16du="http://schemas.microsoft.com/office/word/2023/wordml/word16du" xmlns:w16sdtdh="http://schemas.microsoft.com/office/word/2020/wordml/sdtdatahash" xmlns:w16sdtfl="http://schemas.microsoft.com/office/word/2024/wordml/sdtformatlock" xmlns:w16se="http://schemas.microsoft.com/office/word/2015/wordml/symex" xmlns:wpg="http://schemas.microsoft.com/office/word/2010/wordprocessingGroup" xmlns:wpi="http://schemas.microsoft.com/office/word/2010/wordprocessingInk" xmlns:wne="http://schemas.microsoft.com/office/word/2006/wordml" xmlns:wps="http://schemas.microsoft.com/office/word/2010/wordprocessingShape" mc:Ignorable="w14 w15 w16se w16cid w16 w16cex w16sdtdh w16sdtfl cr w16du wp14">
-  <w16cex:commentExtensible w16cex:durableId="61585C5E" w16cex:dateUtc="2026-10-14T06:01:00Z"/>
-</w16cex:commentsExtensible>
-</file>
-
-<file path=word/commentsIds.xml><?xml version="1.0" encoding="utf-8"?>
-<w16cid:commentsIds xmlns:wpc="http://schemas.microsoft.com/office/word/2010/wordprocessingCanvas" xmlns:cx="http://schemas.microsoft.com/office/drawing/2014/chartex" xmlns:cx1="http://schemas.microsoft.com/office/drawing/2015/9/8/chartex" xmlns:cx2="http://schemas.microsoft.com/office/drawing/2015/10/21/chartex" xmlns:cx3="http://schemas.microsoft.com/office/drawing/2016/5/9/chartex" xmlns:cx4="http://schemas.microsoft.com/office/drawing/2016/5/10/chartex" xmlns:cx5="http://schemas.microsoft.com/office/drawing/2016/5/11/chartex" xmlns:cx6="http://schemas.microsoft.com/office/drawing/2016/5/12/chartex" xmlns:cx7="http://schemas.microsoft.com/office/drawing/2016/5/13/chartex" xmlns:cx8="http://schemas.microsoft.com/office/drawing/2016/5/14/chartex" xmlns:mc="http://schemas.openxmlformats.org/markup-compatibility/2006" xmlns:aink="http://schemas.microsoft.com/office/drawing/2016/ink" xmlns:am3d="http://schemas.microsoft.com/office/drawing/2017/model3d" xmlns:o="urn:schemas-microsoft-com:office:office" xmlns:oel="http://schemas.microsoft.com/office/2019/extlst" xmlns:r="http://schemas.openxmlformats.org/officeDocument/2006/relationships" xmlns:m="http://schemas.openxmlformats.org/officeDocument/2006/math" xmlns:v="urn:schemas-microsoft-com:vml" xmlns:wp14="http://schemas.microsoft.com/office/word/2010/wordprocessingDrawing" xmlns:wp="http://schemas.openxmlformats.org/drawingml/2006/wordprocessingDrawing" xmlns:w10="urn:schemas-microsoft-com:office:word" xmlns:w="http://schemas.openxmlformats.org/wordprocessingml/2006/main" xmlns:w14="http://schemas.microsoft.com/office/word/2010/wordml" xmlns:w15="http://schemas.microsoft.com/office/word/2012/wordml" xmlns:w16cex="http://schemas.microsoft.com/office/word/2018/wordml/cex" xmlns:w16cid="http://schemas.microsoft.com/office/word/2016/wordml/cid" xmlns:w16="http://schemas.microsoft.com/office/word/2018/wordml" xmlns:w16du="http://schemas.microsoft.com/office/word/2023/wordml/word16du" xmlns:w16sdtdh="http://schemas.microsoft.com/office/word/2020/wordml/sdtdatahash" xmlns:w16sdtfl="http://schemas.microsoft.com/office/word/2024/wordml/sdtformatlock" xmlns:w16se="http://schemas.microsoft.com/office/word/2015/wordml/symex" xmlns:wpg="http://schemas.microsoft.com/office/word/2010/wordprocessingGroup" xmlns:wpi="http://schemas.microsoft.com/office/word/2010/wordprocessingInk" xmlns:wne="http://schemas.microsoft.com/office/word/2006/wordml" xmlns:wps="http://schemas.microsoft.com/office/word/2010/wordprocessingShape" mc:Ignorable="w14 w15 w16se w16cid w16 w16cex w16sdtdh w16sdtfl w16du wp14">
-  <w16cid:commentId w16cid:paraId="617894E2" w16cid:durableId="61585C5E"/>
-</w16cid:commentsIds>
 </file>
 
 <file path=word/endnotes.xml><?xml version="1.0" encoding="utf-8"?>
@@ -24303,14 +24251,6 @@
 </w:numbering>
 </file>
 
-<file path=word/people.xml><?xml version="1.0" encoding="utf-8"?>
-<w15:people xmlns:wpc="http://schemas.microsoft.com/office/word/2010/wordprocessingCanvas" xmlns:cx="http://schemas.microsoft.com/office/drawing/2014/chartex" xmlns:cx1="http://schemas.microsoft.com/office/drawing/2015/9/8/chartex" xmlns:cx2="http://schemas.microsoft.com/office/drawing/2015/10/21/chartex" xmlns:cx3="http://schemas.microsoft.com/office/drawing/2016/5/9/chartex" xmlns:cx4="http://schemas.microsoft.com/office/drawing/2016/5/10/chartex" xmlns:cx5="http://schemas.microsoft.com/office/drawing/2016/5/11/chartex" xmlns:cx6="http://schemas.microsoft.com/office/drawing/2016/5/12/chartex" xmlns:cx7="http://schemas.microsoft.com/office/drawing/2016/5/13/chartex" xmlns:cx8="http://schemas.microsoft.com/office/drawing/2016/5/14/chartex" xmlns:mc="http://schemas.openxmlformats.org/markup-compatibility/2006" xmlns:aink="http://schemas.microsoft.com/office/drawing/2016/ink" xmlns:am3d="http://schemas.microsoft.com/office/drawing/2017/model3d" xmlns:o="urn:schemas-microsoft-com:office:office" xmlns:oel="http://schemas.microsoft.com/office/2019/extlst" xmlns:r="http://schemas.openxmlformats.org/officeDocument/2006/relationships" xmlns:m="http://schemas.openxmlformats.org/officeDocument/2006/math" xmlns:v="urn:schemas-microsoft-com:vml" xmlns:wp14="http://schemas.microsoft.com/office/word/2010/wordprocessingDrawing" xmlns:wp="http://schemas.openxmlformats.org/drawingml/2006/wordprocessingDrawing" xmlns:w10="urn:schemas-microsoft-com:office:word" xmlns:w="http://schemas.openxmlformats.org/wordprocessingml/2006/main" xmlns:w14="http://schemas.microsoft.com/office/word/2010/wordml" xmlns:w15="http://schemas.microsoft.com/office/word/2012/wordml" xmlns:w16cex="http://schemas.microsoft.com/office/word/2018/wordml/cex" xmlns:w16cid="http://schemas.microsoft.com/office/word/2016/wordml/cid" xmlns:w16="http://schemas.microsoft.com/office/word/2018/wordml" xmlns:w16du="http://schemas.microsoft.com/office/word/2023/wordml/word16du" xmlns:w16sdtdh="http://schemas.microsoft.com/office/word/2020/wordml/sdtdatahash" xmlns:w16sdtfl="http://schemas.microsoft.com/office/word/2024/wordml/sdtformatlock" xmlns:w16se="http://schemas.microsoft.com/office/word/2015/wordml/symex" xmlns:wpg="http://schemas.microsoft.com/office/word/2010/wordprocessingGroup" xmlns:wpi="http://schemas.microsoft.com/office/word/2010/wordprocessingInk" xmlns:wne="http://schemas.microsoft.com/office/word/2006/wordml" xmlns:wps="http://schemas.microsoft.com/office/word/2010/wordprocessingShape" mc:Ignorable="w14 w15 w16se w16cid w16 w16cex w16sdtdh w16sdtfl w16du wp14">
-  <w15:person w15:author="lonnnmirabueno@outlook.com">
-    <w15:presenceInfo w15:providerId="Windows Live" w15:userId="acdcbd766da33ecd"/>
-  </w15:person>
-</w15:people>
-</file>
-
 <file path=word/styles.xml><?xml version="1.0" encoding="utf-8"?>
 <w:styles xmlns:mc="http://schemas.openxmlformats.org/markup-compatibility/2006" xmlns:r="http://schemas.openxmlformats.org/officeDocument/2006/relationships" xmlns:w="http://schemas.openxmlformats.org/wordprocessingml/2006/main" xmlns:w14="http://schemas.microsoft.com/office/word/2010/wordml" xmlns:w15="http://schemas.microsoft.com/office/word/2012/wordml" xmlns:w16cex="http://schemas.microsoft.com/office/word/2018/wordml/cex" xmlns:w16cid="http://schemas.microsoft.com/office/word/2016/wordml/cid" xmlns:w16="http://schemas.microsoft.com/office/word/2018/wordml" xmlns:w16du="http://schemas.microsoft.com/office/word/2023/wordml/word16du" xmlns:w16sdtdh="http://schemas.microsoft.com/office/word/2020/wordml/sdtdatahash" xmlns:w16sdtfl="http://schemas.microsoft.com/office/word/2024/wordml/sdtformatlock" xmlns:w16se="http://schemas.microsoft.com/office/word/2015/wordml/symex" mc:Ignorable="w14 w15 w16se w16cid w16 w16cex w16sdtdh w16sdtfl w16du">
   <w:docDefaults>

</xml_diff>

<commit_message>
Thesis: Figure 11 fits below its description; page numbers synced
Co-Authored-By: Claude Opus 5.5 <noreply@anthropic.com>
Claude-Session: https://claude.ai/code/session_01MN4gTfErSULVtFJnUJ6zoR
</commit_message>
<xml_diff>
--- a/docs/paper/Thesis - Auditrix for KSU.docx
+++ b/docs/paper/Thesis - Auditrix for KSU.docx
@@ -457,7 +457,7 @@
           <w:footerReference w:type="default" r:id="rId12"/>
           <w:headerReference w:type="first" r:id="rId13"/>
           <w:footerReference w:type="first" r:id="rId14"/>
-          <w:pgSz w:w="11906" w:h="16838"/>
+          <w:pgSz w:w="12240" w:h="15840" w:code="1"/>
           <w:pgMar w:top="1440" w:right="1440" w:bottom="1440" w:left="2160" w:header="709" w:footer="709" w:gutter="0"/>
           <w:pgNumType w:fmt="lowerRoman" w:start="1" w:chapStyle="1"/>
           <w:cols w:space="708"/>
@@ -2521,7 +2521,7 @@
           <w:szCs w:val="24"/>
         </w:rPr>
         <w:tab/>
-        <w:t>84</w:t>
+        <w:t>83</w:t>
       </w:r>
     </w:p>
     <w:p>
@@ -2582,7 +2582,7 @@
           <w:szCs w:val="24"/>
         </w:rPr>
         <w:tab/>
-        <w:t>92</w:t>
+        <w:t>91</w:t>
       </w:r>
     </w:p>
     <w:p>
@@ -2654,7 +2654,7 @@
           <w:szCs w:val="24"/>
         </w:rPr>
         <w:tab/>
-        <w:t>97</w:t>
+        <w:t>96</w:t>
       </w:r>
     </w:p>
     <w:p>
@@ -2704,7 +2704,7 @@
           <w:szCs w:val="24"/>
         </w:rPr>
         <w:tab/>
-        <w:t>97</w:t>
+        <w:t>96</w:t>
       </w:r>
     </w:p>
     <w:p>
@@ -2736,7 +2736,7 @@
           <w:szCs w:val="24"/>
         </w:rPr>
         <w:tab/>
-        <w:t>100</w:t>
+        <w:t>99</w:t>
       </w:r>
     </w:p>
     <w:p>
@@ -2778,7 +2778,7 @@
           <w:szCs w:val="24"/>
         </w:rPr>
         <w:tab/>
-        <w:t>102</w:t>
+        <w:t>101</w:t>
       </w:r>
     </w:p>
     <w:p>
@@ -2829,7 +2829,7 @@
           <w:szCs w:val="24"/>
         </w:rPr>
         <w:tab/>
-        <w:t>104</w:t>
+        <w:t>103</w:t>
       </w:r>
     </w:p>
     <w:p>
@@ -3126,7 +3126,7 @@
           <w:szCs w:val="24"/>
         </w:rPr>
         <w:tab/>
-        <w:t>93</w:t>
+        <w:t>92</w:t>
       </w:r>
     </w:p>
     <w:p>
@@ -3473,7 +3473,7 @@
           <w:sz w:val="24"/>
           <w:szCs w:val="24"/>
         </w:rPr>
-        <w:t xml:space="preserve">Figure 7. Activity Diagram for Enter Grades . . . .</w:t>
+        <w:t>Figure 7. Activity Diagram for Enter Grades . . . .</w:t>
       </w:r>
       <w:r>
         <w:rPr>
@@ -3679,7 +3679,7 @@
           <w:szCs w:val="24"/>
         </w:rPr>
         <w:tab/>
-        <w:t>82</w:t>
+        <w:t>81</w:t>
       </w:r>
     </w:p>
     <w:p>
@@ -3746,7 +3746,7 @@
           <w:szCs w:val="24"/>
         </w:rPr>
         <w:tab/>
-        <w:t>83</w:t>
+        <w:t>82</w:t>
       </w:r>
     </w:p>
     <w:p>
@@ -3795,7 +3795,7 @@
           <w:szCs w:val="24"/>
         </w:rPr>
         <w:tab/>
-        <w:t>85</w:t>
+        <w:t>84</w:t>
       </w:r>
     </w:p>
     <w:p>
@@ -3844,7 +3844,7 @@
           <w:szCs w:val="24"/>
         </w:rPr>
         <w:tab/>
-        <w:t>85</w:t>
+        <w:t>84</w:t>
       </w:r>
     </w:p>
     <w:p>
@@ -3875,7 +3875,7 @@
           <w:szCs w:val="24"/>
         </w:rPr>
         <w:tab/>
-        <w:t>86</w:t>
+        <w:t>85</w:t>
       </w:r>
     </w:p>
     <w:p>
@@ -3927,7 +3927,7 @@
           <w:szCs w:val="24"/>
         </w:rPr>
         <w:tab/>
-        <w:t>87</w:t>
+        <w:t>86</w:t>
       </w:r>
     </w:p>
     <w:p>
@@ -3987,7 +3987,7 @@
           <w:szCs w:val="24"/>
         </w:rPr>
         <w:tab/>
-        <w:t>87</w:t>
+        <w:t>86</w:t>
       </w:r>
     </w:p>
     <w:p>
@@ -4028,7 +4028,7 @@
           <w:szCs w:val="24"/>
         </w:rPr>
         <w:tab/>
-        <w:t>88</w:t>
+        <w:t>87</w:t>
       </w:r>
     </w:p>
     <w:p>
@@ -4077,7 +4077,7 @@
           <w:szCs w:val="24"/>
         </w:rPr>
         <w:tab/>
-        <w:t>88</w:t>
+        <w:t>87</w:t>
       </w:r>
     </w:p>
     <w:p>
@@ -4126,7 +4126,7 @@
           <w:szCs w:val="24"/>
         </w:rPr>
         <w:tab/>
-        <w:t>89</w:t>
+        <w:t>88</w:t>
       </w:r>
     </w:p>
     <w:p>
@@ -4175,7 +4175,7 @@
           <w:szCs w:val="24"/>
         </w:rPr>
         <w:tab/>
-        <w:t>90</w:t>
+        <w:t>89</w:t>
       </w:r>
     </w:p>
     <w:p>
@@ -4227,7 +4227,7 @@
           <w:szCs w:val="24"/>
         </w:rPr>
         <w:tab/>
-        <w:t>90</w:t>
+        <w:t>89</w:t>
       </w:r>
     </w:p>
     <w:p>
@@ -4287,7 +4287,7 @@
           <w:szCs w:val="24"/>
         </w:rPr>
         <w:tab/>
-        <w:t>91</w:t>
+        <w:t>90</w:t>
       </w:r>
     </w:p>
     <w:p>
@@ -4327,7 +4327,7 @@
           <w:szCs w:val="24"/>
         </w:rPr>
         <w:tab/>
-        <w:t>91</w:t>
+        <w:t>90</w:t>
       </w:r>
     </w:p>
     <w:p>
@@ -9179,7 +9179,7 @@
           <w:sz w:val="24"/>
           <w:szCs w:val="24"/>
         </w:rPr>
-        <w:t xml:space="preserve"> takes place using Next.js with React and TypeScript, with development divided into three functional increments. The first increment (July 2026) produced the core of the system: curriculum management, student registration, grade entry and a basic audit of prerequisites. The second increment (August to September 2026) added curriculum versions, deans and colleges, shifting, transfers and drops, curriculum and student imports with an import preview, a redesign of the user interface, the first-login password change, and the curriculum change history. The third increment (late September to October 2026) replaced the first prerequisite checker with a term-based one that also covers co-requisites and INC grades, and added the current semester, automatic year levels, the regular and irregular classification, support for Excel files, protection against an earlier-term grade replacing a later one, the marking of subjects in progress, midyear terms written as on KSU records, locked records for dropped and transferred-out </w:t>
+        <w:t xml:space="preserve"> takes place using Next.js with React and TypeScript, with development divided into three functional increments. The first increment (July 2026) produced the core of the system: curriculum management, student registration, grade entry and a basic audit of prerequisites. The second increment (August to September 2026) added curriculum versions, deans and colleges, shifting, transfers and drops, curriculum and student imports with an import preview, a redesign of the user interface, the first-login password change, and the curriculum change history. The third increment (late September to October 2026) replaced the first prerequisite checker with a term-based one that also covers co-requisites and INC grades, and added the current semester, automatic year levels, the regular and irregular classification, support for Excel files, protection against an earlier-term grade replacing a later one, midyear terms written as on KSU records, locked records for dropped and transferred-out students, dashboard charts with a Student </w:t>
       </w:r>
       <w:r>
         <w:rPr>
@@ -9188,7 +9188,7 @@
           <w:szCs w:val="24"/>
         </w:rPr>
         <w:lastRenderedPageBreak/>
-        <w:t>students, dashboard charts with a Student Movements page, and security measures such as a database-enforced audit trail, role checks on every page and automatic sign-out. Each increment results in a functional version of the software that builds upon the previous one.</w:t>
+        <w:t>Movements page, and security measures such as a database-enforced audit trail, role checks on every page and automatic sign-out. Each increment results in a functional version of the software that builds upon the previous one.</w:t>
       </w:r>
     </w:p>
     <w:p>
@@ -9245,6 +9245,18 @@
         </w:rPr>
         <w:t>As each increment is completed, it undergoes rigorous verification to ensure technical reliability. This includes unit testing of the audit rules and the other modules, and integration testing of the server actions, both written with the built-in test runner of Node.js; and functional (end-to-end) testing, in which a web browser is scripted with Playwright to log in as a dean and as chairpersons and use each feature on a local copy of the full system. The researchers also perform "negative testing" by entering invalid grades, malformed terms and student ID numbers, and incorrectly formatted import files to verify that the system rejects them with a reason, and by entering the same grades in different orders to verify that the audit flags the same subjects as Violation regardless of the order of entry, and by opening the pages of another role to verify that access is refused.</w:t>
       </w:r>
+    </w:p>
+    <w:p>
+      <w:pPr>
+        <w:spacing w:line="480" w:lineRule="auto"/>
+        <w:ind w:firstLine="720"/>
+        <w:jc w:val="both"/>
+        <w:rPr>
+          <w:rFonts w:ascii="Courier New" w:hAnsi="Courier New" w:cs="Courier New"/>
+          <w:sz w:val="24"/>
+          <w:szCs w:val="24"/>
+        </w:rPr>
+      </w:pPr>
     </w:p>
     <w:p>
       <w:pPr>
@@ -12607,25 +12619,23 @@
           <w:sz w:val="24"/>
           <w:szCs w:val="24"/>
         </w:rPr>
-        <w:t xml:space="preserve"> Per the Student Handbook and the Operations Manual, a student is regular when enrolled in the full prescribed load for the current semester, and irregular when enrolled in less; the missing subjects are listed. The prescribed load is taken to be the curriculum's subjects for the student's year level and the current semester, not counting subjects already passed in an earlier term, and back subjects taken on top of a full load do not make a student irregular. Enrollment is known from the grades (or "in progress" records) of the current semester; with nothing recorded, the status is "Not determined," and the student is not counted either way. At the start of a semester, the chairperson marks the subjects each student is taking as </w:t>
-      </w:r>
-      <w:proofErr w:type="gramStart"/>
-      <w:r>
-        <w:rPr>
-          <w:rFonts w:ascii="Courier New" w:hAnsi="Courier New" w:cs="Courier New"/>
-          <w:sz w:val="24"/>
-          <w:szCs w:val="24"/>
-        </w:rPr>
-        <w:t>In</w:t>
-      </w:r>
-      <w:proofErr w:type="gramEnd"/>
-      <w:r>
-        <w:rPr>
-          <w:rFonts w:ascii="Courier New" w:hAnsi="Courier New" w:cs="Courier New"/>
-          <w:sz w:val="24"/>
-          <w:szCs w:val="24"/>
-        </w:rPr>
-        <w:t xml:space="preserve"> progress, so the status is known before any grades come in.</w:t>
+        <w:t xml:space="preserve"> Per the Student Handbook and the Operations Manual, a student is regular when enrolled in the full prescribed load for the current semester, and irregular when enrolled in less; the missing subjects are listed. The prescribed load is taken to be the curriculum's subjects for the student's year level and the current semester, not counting subjects already passed in an earlier term, and back subjects taken on top of a full load do not make a student irregular. Enrollment is known from the grades</w:t>
+      </w:r>
+      <w:r>
+        <w:rPr>
+          <w:rFonts w:ascii="Courier New" w:hAnsi="Courier New" w:cs="Courier New"/>
+          <w:sz w:val="24"/>
+          <w:szCs w:val="24"/>
+        </w:rPr>
+        <w:t xml:space="preserve"> recorded for </w:t>
+      </w:r>
+      <w:r>
+        <w:rPr>
+          <w:rFonts w:ascii="Courier New" w:hAnsi="Courier New" w:cs="Courier New"/>
+          <w:sz w:val="24"/>
+          <w:szCs w:val="24"/>
+        </w:rPr>
+        <w:t>the current semester; with nothing recorded, the status is "Not determined," and the student is not counted either way.</w:t>
       </w:r>
     </w:p>
     <w:p>
@@ -12691,7 +12701,7 @@
           <w:sz w:val="24"/>
           <w:szCs w:val="24"/>
         </w:rPr>
-        <w:t xml:space="preserve"> progress at once; ticking all leaves out the subjects the student cannot take yet (e.g., "Can't take yet. Needs: MATH 111"), </w:t>
+        <w:t xml:space="preserve"> progress at once; ticking all leaves out the subjects the student cannot take yet (e.g., "Can't take yet. Needs: MATH 111"), which can still be ticked one by one if the student is enrolled in them anyway. Only changed grades are saved, and changing an existing grade is treated as a correction that </w:t>
       </w:r>
       <w:r>
         <w:rPr>
@@ -12700,7 +12710,7 @@
           <w:szCs w:val="24"/>
         </w:rPr>
         <w:lastRenderedPageBreak/>
-        <w:t>which can still be ticked one by one if the student is enrolled in them anyway. Only changed grades are saved, and changing an existing grade is treated as a correction that asks for confirmation. A final grade for an INC keeps the subject in the term it was taken and records the term in which the INC was resolved (shown as "INC → 25-1"). Since only the latest attempt of a subject is kept as the student's record, a grade from an earlier term than the recorded one is refused unless the chairperson confirms that it corrects a wrongly entered term. After saving, a message names any subject that has just become a violation, and every grade ever entered is kept in the student's grade logbook together with who entered it and when. The database writes this logbook itself, so its entries cannot be edited or deleted, and it accepts only KSU grades that match their status and well-formed terms.</w:t>
+        <w:t>asks for confirmation. A final grade for an INC keeps the subject in the term it was taken and records the term in which the INC was resolved (shown as "INC → 25-1"). Since only the latest attempt of a subject is kept as the student's record, a grade from an earlier term than the recorded one is refused unless the chairperson confirms that it corrects a wrongly entered term. After saving, a message names any subject that has just become a violation, and every grade ever entered is kept in the student's grade logbook together with who entered it and when. The database writes this logbook itself, so its entries cannot be edited or deleted, and it accepts only KSU grades that match their status and well-formed terms.</w:t>
       </w:r>
     </w:p>
     <w:p>
@@ -12766,16 +12776,7 @@
           <w:sz w:val="24"/>
           <w:szCs w:val="24"/>
         </w:rPr>
-        <w:t xml:space="preserve">) or CSV file, in a format designed by the researchers, with a preview of what will be added, changed or removed before saving, exported to CSV </w:t>
-      </w:r>
-      <w:r>
-        <w:rPr>
-          <w:rFonts w:ascii="Courier New" w:hAnsi="Courier New" w:cs="Courier New"/>
-          <w:sz w:val="24"/>
-          <w:szCs w:val="24"/>
-        </w:rPr>
-        <w:lastRenderedPageBreak/>
-        <w:t>or PDF, and every change is kept in a per-version change history showing who changed what, and when.</w:t>
+        <w:t>) or CSV file, in a format designed by the researchers, with a preview of what will be added, changed or removed before saving, exported to CSV or PDF, and every change is kept in a per-version change history showing who changed what, and when.</w:t>
       </w:r>
     </w:p>
     <w:p>
@@ -12797,6 +12798,7 @@
           <w:sz w:val="24"/>
           <w:szCs w:val="24"/>
         </w:rPr>
+        <w:lastRenderedPageBreak/>
         <w:t>Students and Student Movements.</w:t>
       </w:r>
       <w:r>
@@ -12845,16 +12847,24 @@
           <w:sz w:val="24"/>
           <w:szCs w:val="24"/>
         </w:rPr>
+        <w:t>Dashboard.</w:t>
+      </w:r>
+      <w:r>
+        <w:rPr>
+          <w:rFonts w:ascii="Courier New" w:hAnsi="Courier New" w:cs="Courier New"/>
+          <w:sz w:val="24"/>
+          <w:szCs w:val="24"/>
+        </w:rPr>
+        <w:t xml:space="preserve"> A "Needs attention" banner at the top lists what to act on, such as students with violations, students with nothing recorded for the current semester, or an unset </w:t>
+      </w:r>
+      <w:r>
+        <w:rPr>
+          <w:rFonts w:ascii="Courier New" w:hAnsi="Courier New" w:cs="Courier New"/>
+          <w:sz w:val="24"/>
+          <w:szCs w:val="24"/>
+        </w:rPr>
         <w:lastRenderedPageBreak/>
-        <w:t>Dashboard.</w:t>
-      </w:r>
-      <w:r>
-        <w:rPr>
-          <w:rFonts w:ascii="Courier New" w:hAnsi="Courier New" w:cs="Courier New"/>
-          <w:sz w:val="24"/>
-          <w:szCs w:val="24"/>
-        </w:rPr>
-        <w:t xml:space="preserve"> A "Needs attention" banner at the top lists what to act on, such as students with violations, students with nothing recorded for the current semester, or an unset semester, each linked to the matching filtered student list. Per program, the dashboard shows the total number of students, the regular and irregular students (and how many are not yet determined), the students with violations, the curriculum versions, and the number of shifts, transfers and drops. Four charts are built only from recorded data: regular, irregular and not determined students; students by year level from Freshman to Senior; bottleneck subjects, where the most students' latest grade is 5.0 or INC; and the subjects most often taken out of order. Each chart has a short explanation, shows the exact numbers on hover, and can be viewed as a table. The Dean sets the current semester from the dashboard and compares the programs of the college side by side, but does not open individual students' records, which remain the chairperson's work.</w:t>
+        <w:t>semester, each linked to the matching filtered student list. Per program, the dashboard shows the total number of students, the regular and irregular students (and how many are not yet determined), the students with violations, the curriculum versions, and the number of shifts, transfers and drops. Four charts are built only from recorded data: regular, irregular and not determined students; students by year level from Freshman to Senior; bottleneck subjects, where the most students' latest grade is 5.0 or INC; and the subjects most often taken out of order. Each chart has a short explanation, shows the exact numbers on hover, and can be viewed as a table. The Dean sets the current semester from the dashboard and compares the programs of the college side by side, but does not open individual students' records, which remain the chairperson's work.</w:t>
       </w:r>
     </w:p>
     <w:p>
@@ -12884,7 +12894,7 @@
           <w:sz w:val="24"/>
           <w:szCs w:val="24"/>
         </w:rPr>
-        <w:t xml:space="preserve"> Program Chairpersons see only the data of their own program, while Deans see their whole college. Operations that must all succeed together, such as creating a program with its chairperson account, replacing a chairperson, or accepting a shifting student. A new chairperson receives a temporary password </w:t>
+        <w:t xml:space="preserve"> Program Chairpersons see only the data of their own program, while Deans see their whole college. Operations that must all succeed together, such as creating a program with its chairperson account, replacing a chairperson, or accepting a shifting student. A new chairperson receives a temporary password from the Dean and must choose their own at first login, guided by a checklist that ticks each password rule as it is met, and actions that are hard to undo, such as dropping </w:t>
       </w:r>
       <w:r>
         <w:rPr>
@@ -12893,7 +12903,7 @@
           <w:szCs w:val="24"/>
         </w:rPr>
         <w:lastRenderedPageBreak/>
-        <w:t>from the Dean and must choose their own at first login, guided by a checklist that ticks each password rule as it is met, and actions that are hard to undo, such as dropping a student or saving grades, ask for confirmation first. Every page checks the user's role, so a page meant for another role cannot be opened by typing its address; users are signed out after 30 minutes without activity; and an account is blocked for 15 minutes after five wrong passwords.</w:t>
+        <w:t>a student or saving grades, ask for confirmation first. Every page checks the user's role, so a page meant for another role cannot be opened by typing its address; users are signed out after 30 minutes without activity; and an account is blocked for 15 minutes after five wrong passwords.</w:t>
       </w:r>
     </w:p>
     <w:p>
@@ -12955,7 +12965,7 @@
           <w:sz w:val="24"/>
           <w:szCs w:val="24"/>
         </w:rPr>
-        <w:t xml:space="preserve"> are described through its functional and non-functional requirements. The functional requirements state what the system must do for its users: it lets the Dean and the Program Chairperson log in with their staff accounts and manage their account settings; registers students one at a time or by batch from an Excel, CSV, or KSU-MIS export file; records grades per term using the KSU grade values, including INC and its completion, while keeping a logbook of every grade entered or changed; audits every subject of a student's curriculum against its prerequisites, co-requisites, year-standing, and "all subjects completed" requirements and gives each subject one of five statuses with the reason; works out each student's </w:t>
+        <w:t xml:space="preserve"> are described through its functional and non-functional requirements. The functional requirements state what the system must do for its users: it lets the Dean and the Program Chairperson log in with their staff accounts and manage their account settings; registers students one at a time or by batch from an Excel, CSV, or KSU-MIS export file; records grades per term using the KSU grade values, including INC and its completion, while keeping a logbook of every grade entered or changed; audits every subject of a student's curriculum against its prerequisites, co-requisites, year-standing, and "all subjects completed" requirements and gives each subject one of five statuses with the reason; works out each student's year level and classifies the student as regular or irregular; shows and prints each student's audit report; manages curriculum versions with their import, export, and </w:t>
       </w:r>
       <w:r>
         <w:rPr>
@@ -12964,16 +12974,7 @@
           <w:szCs w:val="24"/>
         </w:rPr>
         <w:lastRenderedPageBreak/>
-        <w:t xml:space="preserve">year level and classifies the student as regular or irregular; shows and prints each student's audit report; manages curriculum versions with their import, export, and change history; records shifts, transfers, and drops; summarizes each program on a dashboard; and lets the Dean create programs, reassign chairpersons, split the college, and hand over the deanship. The non-functional requirements, on the other hand, describe how well the system performs these functions, guided by the ISO/IEC 25010 software quality model: functional suitability, through audit rules verified by automated tests; reliability, through results that do not depend on the order in which grades are entered and through validated imports; performance efficiency, through an audit that is updated as soon as grades are saved; usability and security, through a consistent interface, role-based access, and a required password change; maintainability, through curriculum versioning and separately tested audit rules; and portability and compatibility, through a </w:t>
-      </w:r>
-      <w:r>
-        <w:rPr>
-          <w:rFonts w:ascii="Courier New" w:hAnsi="Courier New" w:cs="Courier New"/>
-          <w:sz w:val="24"/>
-          <w:szCs w:val="24"/>
-        </w:rPr>
-        <w:lastRenderedPageBreak/>
-        <w:t>responsive web application that runs on desktop, tablet, and smartphone browsers.</w:t>
+        <w:t>change history; records shifts, transfers, and drops; summarizes each program on a dashboard; and lets the Dean create programs, reassign chairpersons, split the college, and hand over the deanship. The non-functional requirements, on the other hand, describe how well the system performs these functions, guided by the ISO/IEC 25010 software quality model: functional suitability, through audit rules verified by automated tests; reliability, through results that do not depend on the order in which grades are entered and through validated imports; performance efficiency, through an audit that is updated as soon as grades are saved; usability and security, through a consistent interface, role-based access, and a required password change; maintainability, through curriculum versioning and separately tested audit rules; and portability and compatibility, through a responsive web application that runs on desktop, tablet, and smartphone browsers.</w:t>
       </w:r>
       <w:r>
         <w:rPr>
@@ -13228,6 +13229,7 @@
                 <w:sz w:val="20"/>
                 <w:szCs w:val="20"/>
               </w:rPr>
+              <w:lastRenderedPageBreak/>
               <w:t>- Versioned curriculum: subjects with their prerequisites, co-requisites and year-standing requirements</w:t>
             </w:r>
           </w:p>
@@ -13458,16 +13460,7 @@
           <w:sz w:val="24"/>
           <w:szCs w:val="24"/>
         </w:rPr>
-        <w:t xml:space="preserve">Let the Dean and the Program Chairperson log in with their staff accounts, require a new chairperson to replace the temporary password at the first </w:t>
-      </w:r>
-      <w:r>
-        <w:rPr>
-          <w:rFonts w:ascii="Courier New" w:hAnsi="Courier New" w:cs="Courier New"/>
-          <w:sz w:val="24"/>
-          <w:szCs w:val="24"/>
-        </w:rPr>
-        <w:lastRenderedPageBreak/>
-        <w:t>log in, and let each user edit their name and password in Account Settings.</w:t>
+        <w:t>Let the Dean and the Program Chairperson log in with their staff accounts, require a new chairperson to replace the temporary password at the first log in, and let each user edit their name and password in Account Settings.</w:t>
       </w:r>
       <w:r>
         <w:rPr>
@@ -13557,6 +13550,7 @@
           <w:sz w:val="24"/>
           <w:szCs w:val="24"/>
         </w:rPr>
+        <w:lastRenderedPageBreak/>
         <w:t xml:space="preserve">Curriculum audit: </w:t>
       </w:r>
       <w:r>
@@ -13647,7 +13641,6 @@
           <w:sz w:val="24"/>
           <w:szCs w:val="24"/>
         </w:rPr>
-        <w:lastRenderedPageBreak/>
         <w:t xml:space="preserve">Curriculum management: </w:t>
       </w:r>
       <w:r>
@@ -13716,7 +13709,16 @@
           <w:sz w:val="24"/>
           <w:szCs w:val="24"/>
         </w:rPr>
-        <w:t>Summarize each program and list what needs attention, such as students with violations, and let the Dean set the current semester and compare the programs of the college.</w:t>
+        <w:t xml:space="preserve">Summarize each program and list what needs attention, such as students with violations, and let the </w:t>
+      </w:r>
+      <w:r>
+        <w:rPr>
+          <w:rFonts w:ascii="Courier New" w:hAnsi="Courier New" w:cs="Courier New"/>
+          <w:sz w:val="24"/>
+          <w:szCs w:val="24"/>
+        </w:rPr>
+        <w:lastRenderedPageBreak/>
+        <w:t>Dean set the current semester and compare the programs of the college.</w:t>
       </w:r>
     </w:p>
     <w:p>
@@ -13812,16 +13814,7 @@
           <w:sz w:val="24"/>
           <w:szCs w:val="24"/>
         </w:rPr>
-        <w:t xml:space="preserve">The Audit Engine implements the prerequisite, co-requisite, year-standing and "all </w:t>
-      </w:r>
-      <w:r>
-        <w:rPr>
-          <w:rFonts w:ascii="Courier New" w:hAnsi="Courier New" w:cs="Courier New"/>
-          <w:sz w:val="24"/>
-          <w:szCs w:val="24"/>
-        </w:rPr>
-        <w:lastRenderedPageBreak/>
-        <w:t>subjects completed" rules of the KSU Student Handbook and Operations Manual, verified by 163 automated tests.</w:t>
+        <w:t>The Audit Engine implements the prerequisite, co-requisite, year-standing and "all subjects completed" rules of the KSU Student Handbook and Operations Manual, verified by 163 automated tests.</w:t>
       </w:r>
     </w:p>
     <w:p>
@@ -13885,7 +13878,16 @@
           <w:sz w:val="24"/>
           <w:szCs w:val="24"/>
         </w:rPr>
-        <w:t>the interface uses one consistent design with confirmation dialogs and notifications; access is role-scoped via RLS, and new chairpersons must replace their temporary password at first login; every page checks the user's role, users are signed out after 30 minutes without activity, and an account is blocked for 15 minutes after five wrong passwords.</w:t>
+        <w:t xml:space="preserve">the interface uses one consistent design with confirmation dialogs and notifications; access is role-scoped via RLS, and new chairpersons must replace their temporary password at first </w:t>
+      </w:r>
+      <w:r>
+        <w:rPr>
+          <w:rFonts w:ascii="Courier New" w:hAnsi="Courier New" w:cs="Courier New"/>
+          <w:sz w:val="24"/>
+          <w:szCs w:val="24"/>
+        </w:rPr>
+        <w:lastRenderedPageBreak/>
+        <w:t>login; every page checks the user's role, users are signed out after 30 minutes without activity, and an account is blocked for 15 minutes after five wrong passwords.</w:t>
       </w:r>
     </w:p>
     <w:p>
@@ -13961,16 +13963,7 @@
           <w:sz w:val="24"/>
           <w:szCs w:val="24"/>
         </w:rPr>
-        <w:t xml:space="preserve">curriculum versioning allows new curriculum years to be added without altering audit logic for existing cohorts; the audit rules are kept in a </w:t>
-      </w:r>
-      <w:r>
-        <w:rPr>
-          <w:rFonts w:ascii="Courier New" w:hAnsi="Courier New" w:cs="Courier New"/>
-          <w:sz w:val="24"/>
-          <w:szCs w:val="24"/>
-        </w:rPr>
-        <w:lastRenderedPageBreak/>
-        <w:t>separate, tested module, and each database change has an undo script.</w:t>
+        <w:t>curriculum versioning allows new curriculum years to be added without altering audit logic for existing cohorts; the audit rules are kept in a separate, tested module, and each database change has an undo script.</w:t>
       </w:r>
     </w:p>
     <w:p>
@@ -14042,7 +14035,16 @@
           <w:sz w:val="24"/>
           <w:szCs w:val="24"/>
         </w:rPr>
-        <w:t>The Program Chairperson interacts with most modules: managing curriculum versions (including their import and export), registering and importing students, entering grades, viewing each student's audit and grade logbook, setting a year level by hand, recording shifts, transfers and drops, and reopening a locked record. The Dean oversees the college: viewing the dashboard of every program and comparing the programs, setting the current semester, creating programs with their chairperson accounts, reassigning chairpersons, and splitting the college by moving some of its programs to a new college with its own dean, and handing the deanship over to a successor. Both log in, view a dashboard and the Student Movements page, and change their password, and a new chairperson must replace the temporary password at first login. The audit itself needs no separate action: the system performs it whenever a student's audit or the dashboard is shown.</w:t>
+        <w:t xml:space="preserve">The Program Chairperson interacts with most modules: managing curriculum versions (including their import and export), registering and importing students, entering grades, viewing each student's audit and grade logbook, setting a year level by hand, recording shifts, transfers and drops, and reopening a locked record. The Dean oversees the college: viewing the dashboard of every program and comparing the programs, setting the current </w:t>
+      </w:r>
+      <w:r>
+        <w:rPr>
+          <w:rFonts w:ascii="Courier New" w:hAnsi="Courier New" w:cs="Courier New"/>
+          <w:sz w:val="24"/>
+          <w:szCs w:val="24"/>
+        </w:rPr>
+        <w:lastRenderedPageBreak/>
+        <w:t>semester, creating programs with their chairperson accounts, reassigning chairpersons, and splitting the college by moving some of its programs to a new college with its own dean, and handing the deanship over to a successor. Both log in, view a dashboard and the Student Movements page, and change their password, and a new chairperson must replace the temporary password at first login. The audit itself needs no separate action: the system performs it whenever a student's audit or the dashboard is shown.</w:t>
       </w:r>
     </w:p>
     <w:p>
@@ -14060,7 +14062,6 @@
         <w:rPr>
           <w:noProof/>
         </w:rPr>
-        <w:lastRenderedPageBreak/>
         <w:drawing>
           <wp:inline distT="0" distB="0" distL="0" distR="0" wp14:anchorId="21F764E6" wp14:editId="2AE67D15">
             <wp:extent cx="5120640" cy="3037840"/>
@@ -14193,7 +14194,16 @@
           <w:sz w:val="24"/>
           <w:szCs w:val="24"/>
         </w:rPr>
-        <w:t xml:space="preserve">: the Program Chairperson and the Audit Engine. The process starts with the chairperson checking whether the student is new. A new student is first registered or imported from a student list, while an existing student's record is used as it is. The chairperson then enters the student's grade history, which is passed to the Audit Engine. The Audit Engine audits the record against the student's curriculum, comparing the term in which each subject was taken with the terms in which its requirements were met, and gives each subject one of the five statuses in Table </w:t>
+        <w:t xml:space="preserve">: the Program Chairperson and the Audit Engine. The process starts with </w:t>
+      </w:r>
+      <w:r>
+        <w:rPr>
+          <w:rFonts w:ascii="Courier New" w:hAnsi="Courier New" w:cs="Courier New"/>
+          <w:sz w:val="24"/>
+          <w:szCs w:val="24"/>
+        </w:rPr>
+        <w:lastRenderedPageBreak/>
+        <w:t xml:space="preserve">the chairperson checking whether the student is new. A new student is first registered or imported from a student list, while an existing student's record is used as it is. The chairperson then enters the student's grade history, which is passed to the Audit Engine. The Audit Engine audits the record against the student's curriculum, comparing the term in which each subject was taken with the terms in which its requirements were met, and gives each subject one of the five statuses in Table </w:t>
       </w:r>
       <w:r>
         <w:rPr>
@@ -14455,31 +14465,16 @@
           <w:sz w:val="24"/>
           <w:szCs w:val="24"/>
         </w:rPr>
-        <w:t xml:space="preserve">shows how grades are recorded. The chairperson opens the student's Enter Grades page and chooses the year level, the curriculum semester and the term in which the subjects were taken. If the grades are not yet available, the process ends. Otherwise, the chairperson enters the grade of each subject from the KSU grade values, or INC for a subject whose requirements are not yet complete, then reviews the grades and confirms the save. The system checks that each grade is a valid KSU grade and that the term is not after the current semester. If any grade is not valid, the rows to fix are shown and the chairperson corrects them. Once all grades are valid, the system saves them in the grade logbook and audits the student's record again, warning the chairperson if a subject was taken out of order. </w:t>
-      </w:r>
-      <w:r>
-        <w:rPr>
-          <w:rFonts w:ascii="Courier New" w:hAnsi="Courier New" w:cs="Courier New"/>
-          <w:sz w:val="24"/>
-          <w:szCs w:val="24"/>
-        </w:rPr>
-        <w:t>The</w:t>
-      </w:r>
-      <w:r>
-        <w:rPr>
-          <w:rFonts w:ascii="Courier New" w:hAnsi="Courier New" w:cs="Courier New"/>
-          <w:sz w:val="24"/>
-          <w:szCs w:val="24"/>
-        </w:rPr>
-        <w:t xml:space="preserve"> </w:t>
-      </w:r>
-      <w:r>
-        <w:rPr>
-          <w:rFonts w:ascii="Courier New" w:hAnsi="Courier New" w:cs="Courier New"/>
-          <w:sz w:val="24"/>
-          <w:szCs w:val="24"/>
-        </w:rPr>
-        <w:t>chairperson then views the updated audit.</w:t>
+        <w:t xml:space="preserve">shows how grades are recorded. The chairperson opens the student's Enter Grades page and chooses the year level, the curriculum semester and the term in which the subjects were taken. If the grades are not yet available, the process ends. Otherwise, the chairperson enters the grade of each subject from the KSU grade values, or INC for a subject whose requirements are not yet complete, then reviews the grades and confirms the save. The system checks that each grade is a valid KSU grade and that the term is not after the current semester. If any grade is not valid, the rows to fix are shown and </w:t>
+      </w:r>
+      <w:r>
+        <w:rPr>
+          <w:rFonts w:ascii="Courier New" w:hAnsi="Courier New" w:cs="Courier New"/>
+          <w:sz w:val="24"/>
+          <w:szCs w:val="24"/>
+        </w:rPr>
+        <w:lastRenderedPageBreak/>
+        <w:t>the chairperson corrects them. Once all grades are valid, the system saves them in the grade logbook and audits the student's record again, warning the chairperson if a subject was taken out of order. The chairperson then views the updated audit.</w:t>
       </w:r>
     </w:p>
     <w:p>
@@ -14603,7 +14598,7 @@
           <w:sz w:val="24"/>
           <w:szCs w:val="24"/>
         </w:rPr>
-        <w:t xml:space="preserve"> shows how the Dean sets the college's current semester. The Dean enters the school year and semester on the Dashboard, and the system checks the term. If it is valid, the system saves it as the college's current semester and updates the students' year levels and regular </w:t>
+        <w:t xml:space="preserve"> shows how the Dean sets the college's current semester. The Dean enters the school year and semester on </w:t>
       </w:r>
       <w:r>
         <w:rPr>
@@ -14612,7 +14607,7 @@
           <w:szCs w:val="24"/>
         </w:rPr>
         <w:lastRenderedPageBreak/>
-        <w:t xml:space="preserve">or irregular status, which the Dean then sees on the dashboard; </w:t>
+        <w:t xml:space="preserve">the Dashboard, and the system checks the term. If it is valid, the system saves it as the college's current semester and updates the students' year levels and regular or irregular status, which the Dean then sees on the dashboard; </w:t>
       </w:r>
       <w:proofErr w:type="gramStart"/>
       <w:r>
@@ -14752,7 +14747,7 @@
           <w:sz w:val="24"/>
           <w:szCs w:val="24"/>
         </w:rPr>
-        <w:t xml:space="preserve"> shows how the Dean creates a program. The Dean enters the program code, the first curriculum year, and the chairperson's name, email and temporary password. If the program code and email are not yet in use, the system creates the program and the chairperson account and requires the chairperson to change the password at the </w:t>
+        <w:t xml:space="preserve"> shows how the Dean creates a program. The Dean enters the program code, the first curriculum year, and the chairperson's name, email and temporary password. If the program code and email are not yet in use, the system </w:t>
       </w:r>
       <w:r>
         <w:rPr>
@@ -14761,7 +14756,7 @@
           <w:szCs w:val="24"/>
         </w:rPr>
         <w:lastRenderedPageBreak/>
-        <w:t>first log in; the Dean then gives the temporary password to the chairperson.</w:t>
+        <w:t>creates the program and the chairperson account and requires the chairperson to change the password at the first log in; the Dean then gives the temporary password to the chairperson.</w:t>
       </w:r>
     </w:p>
     <w:p>
@@ -14883,7 +14878,16 @@
           <w:sz w:val="24"/>
           <w:szCs w:val="24"/>
         </w:rPr>
-        <w:t xml:space="preserve"> shows how the Dean replaces the chairperson of a program. The Dean chooses the program and enters the new chairperson's name, email and temporary password. If the email is not yet in use, the system creates the new chairperson account and closes the previous chairperson's account, and the Dean gives the temporary password to the new chairperson.</w:t>
+        <w:t xml:space="preserve"> shows how the Dean replaces the chairperson of a program. The Dean chooses the program and enters the new chairperson's name, email and temporary password. If the email is not yet in use, the system creates the new chairperson account and closes the previous chairperson's </w:t>
+      </w:r>
+      <w:r>
+        <w:rPr>
+          <w:rFonts w:ascii="Courier New" w:hAnsi="Courier New" w:cs="Courier New"/>
+          <w:sz w:val="24"/>
+          <w:szCs w:val="24"/>
+        </w:rPr>
+        <w:lastRenderedPageBreak/>
+        <w:t>account, and the Dean gives the temporary password to the new chairperson.</w:t>
       </w:r>
     </w:p>
     <w:p>
@@ -14901,7 +14905,6 @@
         <w:rPr>
           <w:noProof/>
         </w:rPr>
-        <w:lastRenderedPageBreak/>
         <w:drawing>
           <wp:inline distT="0" distB="0" distL="0" distR="0" wp14:anchorId="0C8B9F69" wp14:editId="636F486C">
             <wp:extent cx="4754880" cy="4566920"/>
@@ -15006,7 +15009,7 @@
           <w:sz w:val="24"/>
           <w:szCs w:val="24"/>
         </w:rPr>
-        <w:t xml:space="preserve"> shows how the Program Chairperson manages a curriculum. After opening Manage Curriculum, the chairperson chooses a curriculum version or creates a new one, which may copy an existing version. Subjects are added either by importing an Excel or CSV file, for which the system shows a preview of the subjects to be added, changed or removed before the chairperson confirms the import, or by entering or editing a subject and its requirements one at a time, which the system checks before saving. The system </w:t>
+        <w:t xml:space="preserve"> shows how the Program Chairperson manages a curriculum. After opening Manage Curriculum, the chairperson chooses a curriculum version or creates a new one, which may copy an existing version. Subjects are added either by importing an Excel or CSV file, for which the system shows a preview of the subjects to be added, changed or removed before the chairperson confirms the import, or </w:t>
       </w:r>
       <w:r>
         <w:rPr>
@@ -15015,7 +15018,7 @@
           <w:szCs w:val="24"/>
         </w:rPr>
         <w:lastRenderedPageBreak/>
-        <w:t>saves the subjects and records each change in the version's change history, and the chairperson then views the updated curriculum, which can be exported to CSV or PDF.</w:t>
+        <w:t>by entering or editing a subject and its requirements one at a time, which the system checks before saving. The system saves the subjects and records each change in the version's change history, and the chairperson then views the updated curriculum, which can be exported to CSV or PDF.</w:t>
       </w:r>
     </w:p>
     <w:p>
@@ -15035,7 +15038,7 @@
         </w:rPr>
         <w:drawing>
           <wp:inline distT="0" distB="0" distL="0" distR="0" wp14:anchorId="3F3A49CD" wp14:editId="3A2E0CE6">
-            <wp:extent cx="4572000" cy="6045835"/>
+            <wp:extent cx="4023360" cy="5320334"/>
             <wp:effectExtent l="0" t="0" r="5080" b="0"/>
             <wp:docPr id="9511" name="Figure 11" descr="Figure 11. Activity Diagram for Curriculum Management"/>
             <wp:cNvGraphicFramePr>
@@ -15059,7 +15062,7 @@
                   <pic:spPr>
                     <a:xfrm>
                       <a:off x="0" y="0"/>
-                      <a:ext cx="4572000" cy="6045868"/>
+                      <a:ext cx="4023360" cy="5320334"/>
                     </a:xfrm>
                     <a:prstGeom prst="rect">
                       <a:avLst/>
@@ -26290,18 +26293,8 @@
         <w:sz w:val="24"/>
         <w:szCs w:val="24"/>
       </w:rPr>
-      <w:t>i</w:t>
+      <w:t>ii</w:t>
     </w:r>
-    <w:proofErr w:type="spellStart"/>
-    <w:r>
-      <w:rPr>
-        <w:rFonts w:ascii="Courier New" w:hAnsi="Courier New" w:cs="Courier New"/>
-        <w:sz w:val="24"/>
-        <w:szCs w:val="24"/>
-      </w:rPr>
-      <w:t>i</w:t>
-    </w:r>
-    <w:proofErr w:type="spellEnd"/>
     <w:r>
       <w:rPr>
         <w:rFonts w:ascii="Courier New" w:hAnsi="Courier New" w:cs="Courier New"/>
@@ -34325,6 +34318,7 @@
   <w:style w:type="character" w:default="1" w:styleId="DefaultParagraphFont">
     <w:name w:val="Default Paragraph Font"/>
     <w:uiPriority w:val="1"/>
+    <w:semiHidden/>
     <w:unhideWhenUsed/>
   </w:style>
   <w:style w:type="table" w:default="1" w:styleId="TableNormal">

</xml_diff>

<commit_message>
Thesis: right border line moved 0.25in clear of the text on Letter pages
Co-Authored-By: Claude Opus 5.5 <noreply@anthropic.com>
Claude-Session: https://claude.ai/code/session_01MN4gTfErSULVtFJnUJ6zoR
</commit_message>
<xml_diff>
--- a/docs/paper/Thesis - Auditrix for KSU.docx
+++ b/docs/paper/Thesis - Auditrix for KSU.docx
@@ -26961,7 +26961,7 @@
                 <wp:anchor distT="0" distB="0" distL="114300" distR="114300" simplePos="0" relativeHeight="251662336" behindDoc="0" locked="0" layoutInCell="1" allowOverlap="1" wp14:anchorId="4C51A861" wp14:editId="73B560BC">
                   <wp:simplePos x="0" y="0"/>
                   <wp:positionH relativeFrom="column">
-                    <wp:posOffset>5502910</wp:posOffset>
+                    <wp:posOffset>5715000</wp:posOffset>
                   </wp:positionH>
                   <wp:positionV relativeFrom="paragraph">
                     <wp:posOffset>-419735</wp:posOffset>
@@ -27008,7 +27008,7 @@
             </mc:Choice>
             <mc:Fallback xmlns:wpsCustomData="http://www.wps.cn/officeDocument/2013/wpsCustomData">
               <w:pict>
-                <v:line id="_x0000_s1026" o:spid="_x0000_s1026" o:spt="20" style="position:absolute;left:0pt;margin-left:433.3pt;margin-top:-33.05pt;height:839.95pt;width:0pt;z-index:251697152;mso-width-relative:page;mso-height-relative:page;" filled="f" stroked="t" coordsize="21600,21600" o:gfxdata="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">
+                <v:line id="_x0000_s1026" o:spid="_x0000_s1026" o:spt="20" style="position:absolute;left:0pt;margin-left:450pt;margin-top:-33.05pt;height:839.95pt;width:0pt;z-index:251697152;mso-width-relative:page;mso-height-relative:page;" filled="f" stroked="t" coordsize="21600,21600" o:gfxdata="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">
                   <v:fill on="f" focussize="0,0"/>
                   <v:stroke weight="3pt" color="#000000 [3200]" miterlimit="8" joinstyle="miter"/>
                   <v:imagedata o:title=""/>
@@ -27529,7 +27529,7 @@
                 <wp:anchor distT="0" distB="0" distL="114300" distR="114300" simplePos="0" relativeHeight="251684864" behindDoc="0" locked="0" layoutInCell="1" allowOverlap="1" wp14:anchorId="4B8B8D61" wp14:editId="43BBA0F3">
                   <wp:simplePos x="0" y="0"/>
                   <wp:positionH relativeFrom="column">
-                    <wp:posOffset>5502910</wp:posOffset>
+                    <wp:posOffset>5715000</wp:posOffset>
                   </wp:positionH>
                   <wp:positionV relativeFrom="paragraph">
                     <wp:posOffset>-419735</wp:posOffset>
@@ -27576,7 +27576,7 @@
             </mc:Choice>
             <mc:Fallback xmlns:wpsCustomData="http://www.wps.cn/officeDocument/2013/wpsCustomData">
               <w:pict>
-                <v:line id="_x0000_s1026" o:spid="_x0000_s1026" o:spt="20" style="position:absolute;left:0pt;margin-left:433.3pt;margin-top:-33.05pt;height:839.95pt;width:0pt;z-index:251709440;mso-width-relative:page;mso-height-relative:page;" filled="f" stroked="t" coordsize="21600,21600" o:gfxdata="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">
+                <v:line id="_x0000_s1026" o:spid="_x0000_s1026" o:spt="20" style="position:absolute;left:0pt;margin-left:450pt;margin-top:-33.05pt;height:839.95pt;width:0pt;z-index:251709440;mso-width-relative:page;mso-height-relative:page;" filled="f" stroked="t" coordsize="21600,21600" o:gfxdata="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">
                   <v:fill on="f" focussize="0,0"/>
                   <v:stroke weight="3pt" color="#000000 [3200]" miterlimit="8" joinstyle="miter"/>
                   <v:imagedata o:title=""/>
@@ -28080,7 +28080,7 @@
                 <wp:anchor distT="0" distB="0" distL="114300" distR="114300" simplePos="0" relativeHeight="251672576" behindDoc="0" locked="0" layoutInCell="1" allowOverlap="1" wp14:anchorId="78133536" wp14:editId="13ED4E55">
                   <wp:simplePos x="0" y="0"/>
                   <wp:positionH relativeFrom="column">
-                    <wp:posOffset>5502910</wp:posOffset>
+                    <wp:posOffset>5715000</wp:posOffset>
                   </wp:positionH>
                   <wp:positionV relativeFrom="paragraph">
                     <wp:posOffset>-419735</wp:posOffset>
@@ -28127,7 +28127,7 @@
             </mc:Choice>
             <mc:Fallback xmlns:wpsCustomData="http://www.wps.cn/officeDocument/2013/wpsCustomData">
               <w:pict>
-                <v:line id="_x0000_s1026" o:spid="_x0000_s1026" o:spt="20" style="position:absolute;left:0pt;margin-left:433.3pt;margin-top:-33.05pt;height:839.95pt;width:0pt;z-index:251705344;mso-width-relative:page;mso-height-relative:page;" filled="f" stroked="t" coordsize="21600,21600" o:gfxdata="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">
+                <v:line id="_x0000_s1026" o:spid="_x0000_s1026" o:spt="20" style="position:absolute;left:0pt;margin-left:450pt;margin-top:-33.05pt;height:839.95pt;width:0pt;z-index:251705344;mso-width-relative:page;mso-height-relative:page;" filled="f" stroked="t" coordsize="21600,21600" o:gfxdata="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">
                   <v:fill on="f" focussize="0,0"/>
                   <v:stroke weight="3pt" color="#000000 [3200]" miterlimit="8" joinstyle="miter"/>
                   <v:imagedata o:title=""/>
@@ -28648,7 +28648,7 @@
                 <wp:anchor distT="0" distB="0" distL="114300" distR="114300" simplePos="0" relativeHeight="251682816" behindDoc="0" locked="0" layoutInCell="1" allowOverlap="1" wp14:anchorId="43E3A358" wp14:editId="0EFE448F">
                   <wp:simplePos x="0" y="0"/>
                   <wp:positionH relativeFrom="column">
-                    <wp:posOffset>5502910</wp:posOffset>
+                    <wp:posOffset>5715000</wp:posOffset>
                   </wp:positionH>
                   <wp:positionV relativeFrom="paragraph">
                     <wp:posOffset>-419735</wp:posOffset>
@@ -28695,7 +28695,7 @@
             </mc:Choice>
             <mc:Fallback xmlns:wpsCustomData="http://www.wps.cn/officeDocument/2013/wpsCustomData">
               <w:pict>
-                <v:line id="_x0000_s1026" o:spid="_x0000_s1026" o:spt="20" style="position:absolute;left:0pt;margin-left:433.3pt;margin-top:-33.05pt;height:839.95pt;width:0pt;z-index:251709440;mso-width-relative:page;mso-height-relative:page;" filled="f" stroked="t" coordsize="21600,21600" o:gfxdata="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">
+                <v:line id="_x0000_s1026" o:spid="_x0000_s1026" o:spt="20" style="position:absolute;left:0pt;margin-left:450pt;margin-top:-33.05pt;height:839.95pt;width:0pt;z-index:251709440;mso-width-relative:page;mso-height-relative:page;" filled="f" stroked="t" coordsize="21600,21600" o:gfxdata="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">
                   <v:fill on="f" focussize="0,0"/>
                   <v:stroke weight="3pt" color="#000000 [3200]" miterlimit="8" joinstyle="miter"/>
                   <v:imagedata o:title=""/>
@@ -29187,7 +29187,7 @@
             <wp:anchor distT="0" distB="0" distL="114300" distR="114300" simplePos="0" relativeHeight="251673600" behindDoc="0" locked="0" layoutInCell="1" allowOverlap="1" wp14:anchorId="72D1D185" wp14:editId="765FBF0B">
               <wp:simplePos x="0" y="0"/>
               <wp:positionH relativeFrom="column">
-                <wp:posOffset>5502910</wp:posOffset>
+                <wp:posOffset>5715000</wp:posOffset>
               </wp:positionH>
               <wp:positionV relativeFrom="paragraph">
                 <wp:posOffset>-419735</wp:posOffset>
@@ -29234,7 +29234,7 @@
         </mc:Choice>
         <mc:Fallback xmlns:wpsCustomData="http://www.wps.cn/officeDocument/2013/wpsCustomData">
           <w:pict>
-            <v:line id="_x0000_s1026" o:spid="_x0000_s1026" o:spt="20" style="position:absolute;left:0pt;margin-left:433.3pt;margin-top:-33.05pt;height:839.95pt;width:0pt;z-index:251705344;mso-width-relative:page;mso-height-relative:page;" filled="f" stroked="t" coordsize="21600,21600" o:gfxdata="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">
+            <v:line id="_x0000_s1026" o:spid="_x0000_s1026" o:spt="20" style="position:absolute;left:0pt;margin-left:450pt;margin-top:-33.05pt;height:839.95pt;width:0pt;z-index:251705344;mso-width-relative:page;mso-height-relative:page;" filled="f" stroked="t" coordsize="21600,21600" o:gfxdata="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">
               <v:fill on="f" focussize="0,0"/>
               <v:stroke weight="3pt" color="#000000 [3200]" miterlimit="8" joinstyle="miter"/>
               <v:imagedata o:title=""/>
@@ -29753,7 +29753,7 @@
                 <wp:anchor distT="0" distB="0" distL="114300" distR="114300" simplePos="0" relativeHeight="251683840" behindDoc="0" locked="0" layoutInCell="1" allowOverlap="1" wp14:anchorId="4D8D8D7E" wp14:editId="4A79FBA8">
                   <wp:simplePos x="0" y="0"/>
                   <wp:positionH relativeFrom="column">
-                    <wp:posOffset>5502910</wp:posOffset>
+                    <wp:posOffset>5715000</wp:posOffset>
                   </wp:positionH>
                   <wp:positionV relativeFrom="paragraph">
                     <wp:posOffset>-419735</wp:posOffset>
@@ -29800,7 +29800,7 @@
             </mc:Choice>
             <mc:Fallback xmlns:wpsCustomData="http://www.wps.cn/officeDocument/2013/wpsCustomData">
               <w:pict>
-                <v:line id="_x0000_s1026" o:spid="_x0000_s1026" o:spt="20" style="position:absolute;left:0pt;margin-left:433.3pt;margin-top:-33.05pt;height:839.95pt;width:0pt;z-index:251709440;mso-width-relative:page;mso-height-relative:page;" filled="f" stroked="t" coordsize="21600,21600" o:gfxdata="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">
+                <v:line id="_x0000_s1026" o:spid="_x0000_s1026" o:spt="20" style="position:absolute;left:0pt;margin-left:450pt;margin-top:-33.05pt;height:839.95pt;width:0pt;z-index:251709440;mso-width-relative:page;mso-height-relative:page;" filled="f" stroked="t" coordsize="21600,21600" o:gfxdata="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">
                   <v:fill on="f" focussize="0,0"/>
                   <v:stroke weight="3pt" color="#000000 [3200]" miterlimit="8" joinstyle="miter"/>
                   <v:imagedata o:title=""/>
@@ -30296,7 +30296,7 @@
                 <wp:anchor distT="0" distB="0" distL="114300" distR="114300" simplePos="0" relativeHeight="251625472" behindDoc="0" locked="0" layoutInCell="1" allowOverlap="1" wp14:anchorId="50B1A5F4" wp14:editId="4A386479">
                   <wp:simplePos x="0" y="0"/>
                   <wp:positionH relativeFrom="column">
-                    <wp:posOffset>5502910</wp:posOffset>
+                    <wp:posOffset>5715000</wp:posOffset>
                   </wp:positionH>
                   <wp:positionV relativeFrom="paragraph">
                     <wp:posOffset>-419735</wp:posOffset>
@@ -30343,7 +30343,7 @@
             </mc:Choice>
             <mc:Fallback xmlns:wpsCustomData="http://www.wps.cn/officeDocument/2013/wpsCustomData">
               <w:pict>
-                <v:line id="_x0000_s1026" o:spid="_x0000_s1026" o:spt="20" style="position:absolute;left:0pt;margin-left:433.3pt;margin-top:-33.05pt;height:839.95pt;width:0pt;z-index:251663360;mso-width-relative:page;mso-height-relative:page;" filled="f" stroked="t" coordsize="21600,21600" o:gfxdata="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">
+                <v:line id="_x0000_s1026" o:spid="_x0000_s1026" o:spt="20" style="position:absolute;left:0pt;margin-left:450pt;margin-top:-33.05pt;height:839.95pt;width:0pt;z-index:251663360;mso-width-relative:page;mso-height-relative:page;" filled="f" stroked="t" coordsize="21600,21600" o:gfxdata="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">
                   <v:fill on="f" focussize="0,0"/>
                   <v:stroke weight="3pt" color="#000000 [3200]" miterlimit="8" joinstyle="miter"/>
                   <v:imagedata o:title=""/>
@@ -30815,7 +30815,7 @@
                 <wp:anchor distT="0" distB="0" distL="114300" distR="114300" simplePos="0" relativeHeight="251626496" behindDoc="0" locked="0" layoutInCell="1" allowOverlap="1" wp14:anchorId="12043B18" wp14:editId="475BCB4E">
                   <wp:simplePos x="0" y="0"/>
                   <wp:positionH relativeFrom="column">
-                    <wp:posOffset>5502910</wp:posOffset>
+                    <wp:posOffset>5715000</wp:posOffset>
                   </wp:positionH>
                   <wp:positionV relativeFrom="paragraph">
                     <wp:posOffset>-419735</wp:posOffset>
@@ -30862,7 +30862,7 @@
             </mc:Choice>
             <mc:Fallback xmlns:wpsCustomData="http://www.wps.cn/officeDocument/2013/wpsCustomData">
               <w:pict>
-                <v:line id="_x0000_s1026" o:spid="_x0000_s1026" o:spt="20" style="position:absolute;left:0pt;margin-left:433.3pt;margin-top:-33.05pt;height:839.95pt;width:0pt;z-index:251664384;mso-width-relative:page;mso-height-relative:page;" filled="f" stroked="t" coordsize="21600,21600" o:gfxdata="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">
+                <v:line id="_x0000_s1026" o:spid="_x0000_s1026" o:spt="20" style="position:absolute;left:0pt;margin-left:450pt;margin-top:-33.05pt;height:839.95pt;width:0pt;z-index:251664384;mso-width-relative:page;mso-height-relative:page;" filled="f" stroked="t" coordsize="21600,21600" o:gfxdata="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">
                   <v:fill on="f" focussize="0,0"/>
                   <v:stroke weight="3pt" color="#000000 [3200]" miterlimit="8" joinstyle="miter"/>
                   <v:imagedata o:title=""/>
@@ -31290,7 +31290,7 @@
                 <wp:anchor distT="0" distB="0" distL="114300" distR="114300" simplePos="0" relativeHeight="251650048" behindDoc="0" locked="0" layoutInCell="1" allowOverlap="1" wp14:anchorId="75C782C9" wp14:editId="01F161D8">
                   <wp:simplePos x="0" y="0"/>
                   <wp:positionH relativeFrom="column">
-                    <wp:posOffset>5502910</wp:posOffset>
+                    <wp:posOffset>5715000</wp:posOffset>
                   </wp:positionH>
                   <wp:positionV relativeFrom="paragraph">
                     <wp:posOffset>-419735</wp:posOffset>
@@ -31337,7 +31337,7 @@
             </mc:Choice>
             <mc:Fallback xmlns:wpsCustomData="http://www.wps.cn/officeDocument/2013/wpsCustomData">
               <w:pict>
-                <v:line id="_x0000_s1026" o:spid="_x0000_s1026" o:spt="20" style="position:absolute;left:0pt;margin-left:433.3pt;margin-top:-33.05pt;height:839.95pt;width:0pt;z-index:251684864;mso-width-relative:page;mso-height-relative:page;" filled="f" stroked="t" coordsize="21600,21600" o:gfxdata="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">
+                <v:line id="_x0000_s1026" o:spid="_x0000_s1026" o:spt="20" style="position:absolute;left:0pt;margin-left:450pt;margin-top:-33.05pt;height:839.95pt;width:0pt;z-index:251684864;mso-width-relative:page;mso-height-relative:page;" filled="f" stroked="t" coordsize="21600,21600" o:gfxdata="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">
                   <v:fill on="f" focussize="0,0"/>
                   <v:stroke weight="3pt" color="#000000 [3200]" miterlimit="8" joinstyle="miter"/>
                   <v:imagedata o:title=""/>
@@ -31849,7 +31849,7 @@
                 <wp:anchor distT="0" distB="0" distL="114300" distR="114300" simplePos="0" relativeHeight="251645952" behindDoc="0" locked="0" layoutInCell="1" allowOverlap="1" wp14:anchorId="5BDC0B15" wp14:editId="23A2159F">
                   <wp:simplePos x="0" y="0"/>
                   <wp:positionH relativeFrom="column">
-                    <wp:posOffset>5502910</wp:posOffset>
+                    <wp:posOffset>5715000</wp:posOffset>
                   </wp:positionH>
                   <wp:positionV relativeFrom="paragraph">
                     <wp:posOffset>-419735</wp:posOffset>
@@ -31896,7 +31896,7 @@
             </mc:Choice>
             <mc:Fallback xmlns:wpsCustomData="http://www.wps.cn/officeDocument/2013/wpsCustomData">
               <w:pict>
-                <v:line id="_x0000_s1026" o:spid="_x0000_s1026" o:spt="20" style="position:absolute;left:0pt;margin-left:433.3pt;margin-top:-33.05pt;height:839.95pt;width:0pt;z-index:251680768;mso-width-relative:page;mso-height-relative:page;" filled="f" stroked="t" coordsize="21600,21600" o:gfxdata="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">
+                <v:line id="_x0000_s1026" o:spid="_x0000_s1026" o:spt="20" style="position:absolute;left:0pt;margin-left:450pt;margin-top:-33.05pt;height:839.95pt;width:0pt;z-index:251680768;mso-width-relative:page;mso-height-relative:page;" filled="f" stroked="t" coordsize="21600,21600" o:gfxdata="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">
                   <v:fill on="f" focussize="0,0"/>
                   <v:stroke weight="3pt" color="#000000 [3200]" miterlimit="8" joinstyle="miter"/>
                   <v:imagedata o:title=""/>
@@ -32353,7 +32353,7 @@
                 <wp:anchor distT="0" distB="0" distL="114300" distR="114300" simplePos="0" relativeHeight="251658240" behindDoc="0" locked="0" layoutInCell="1" allowOverlap="1" wp14:anchorId="62C34999" wp14:editId="78EB6DB0">
                   <wp:simplePos x="0" y="0"/>
                   <wp:positionH relativeFrom="column">
-                    <wp:posOffset>5502910</wp:posOffset>
+                    <wp:posOffset>5715000</wp:posOffset>
                   </wp:positionH>
                   <wp:positionV relativeFrom="paragraph">
                     <wp:posOffset>-419735</wp:posOffset>
@@ -32400,7 +32400,7 @@
             </mc:Choice>
             <mc:Fallback xmlns:wpsCustomData="http://www.wps.cn/officeDocument/2013/wpsCustomData">
               <w:pict>
-                <v:line id="_x0000_s1026" o:spid="_x0000_s1026" o:spt="20" style="position:absolute;left:0pt;margin-left:433.3pt;margin-top:-33.05pt;height:839.95pt;width:0pt;z-index:251693056;mso-width-relative:page;mso-height-relative:page;" filled="f" stroked="t" coordsize="21600,21600" o:gfxdata="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">
+                <v:line id="_x0000_s1026" o:spid="_x0000_s1026" o:spt="20" style="position:absolute;left:0pt;margin-left:450pt;margin-top:-33.05pt;height:839.95pt;width:0pt;z-index:251693056;mso-width-relative:page;mso-height-relative:page;" filled="f" stroked="t" coordsize="21600,21600" o:gfxdata="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">
                   <v:fill on="f" focussize="0,0"/>
                   <v:stroke weight="3pt" color="#000000 [3200]" miterlimit="8" joinstyle="miter"/>
                   <v:imagedata o:title=""/>
@@ -32904,7 +32904,7 @@
                 <wp:anchor distT="0" distB="0" distL="114300" distR="114300" simplePos="0" relativeHeight="251654144" behindDoc="0" locked="0" layoutInCell="1" allowOverlap="1" wp14:anchorId="5674625D" wp14:editId="49EE6845">
                   <wp:simplePos x="0" y="0"/>
                   <wp:positionH relativeFrom="column">
-                    <wp:posOffset>5502910</wp:posOffset>
+                    <wp:posOffset>5715000</wp:posOffset>
                   </wp:positionH>
                   <wp:positionV relativeFrom="paragraph">
                     <wp:posOffset>-419735</wp:posOffset>
@@ -32951,7 +32951,7 @@
             </mc:Choice>
             <mc:Fallback xmlns:wpsCustomData="http://www.wps.cn/officeDocument/2013/wpsCustomData">
               <w:pict>
-                <v:line id="_x0000_s1026" o:spid="_x0000_s1026" o:spt="20" style="position:absolute;left:0pt;margin-left:433.3pt;margin-top:-33.05pt;height:839.95pt;width:0pt;z-index:251688960;mso-width-relative:page;mso-height-relative:page;" filled="f" stroked="t" coordsize="21600,21600" o:gfxdata="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">
+                <v:line id="_x0000_s1026" o:spid="_x0000_s1026" o:spt="20" style="position:absolute;left:0pt;margin-left:450pt;margin-top:-33.05pt;height:839.95pt;width:0pt;z-index:251688960;mso-width-relative:page;mso-height-relative:page;" filled="f" stroked="t" coordsize="21600,21600" o:gfxdata="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">
                   <v:fill on="f" focussize="0,0"/>
                   <v:stroke weight="3pt" color="#000000 [3200]" miterlimit="8" joinstyle="miter"/>
                   <v:imagedata o:title=""/>
@@ -33424,7 +33424,7 @@
                 <wp:anchor distT="0" distB="0" distL="114300" distR="114300" simplePos="0" relativeHeight="251666432" behindDoc="0" locked="0" layoutInCell="1" allowOverlap="1" wp14:anchorId="286856A6" wp14:editId="45D0D8D3">
                   <wp:simplePos x="0" y="0"/>
                   <wp:positionH relativeFrom="column">
-                    <wp:posOffset>5502910</wp:posOffset>
+                    <wp:posOffset>5715000</wp:posOffset>
                   </wp:positionH>
                   <wp:positionV relativeFrom="paragraph">
                     <wp:posOffset>-419735</wp:posOffset>
@@ -33471,7 +33471,7 @@
             </mc:Choice>
             <mc:Fallback xmlns:wpsCustomData="http://www.wps.cn/officeDocument/2013/wpsCustomData">
               <w:pict>
-                <v:line id="_x0000_s1026" o:spid="_x0000_s1026" o:spt="20" style="position:absolute;left:0pt;margin-left:433.3pt;margin-top:-33.05pt;height:839.95pt;width:0pt;z-index:251701248;mso-width-relative:page;mso-height-relative:page;" filled="f" stroked="t" coordsize="21600,21600" o:gfxdata="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">
+                <v:line id="_x0000_s1026" o:spid="_x0000_s1026" o:spt="20" style="position:absolute;left:0pt;margin-left:450pt;margin-top:-33.05pt;height:839.95pt;width:0pt;z-index:251701248;mso-width-relative:page;mso-height-relative:page;" filled="f" stroked="t" coordsize="21600,21600" o:gfxdata="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">
                   <v:fill on="f" focussize="0,0"/>
                   <v:stroke weight="3pt" color="#000000 [3200]" miterlimit="8" joinstyle="miter"/>
                   <v:imagedata o:title=""/>

</xml_diff>